<commit_message>
Deploy documentation from docs
</commit_message>
<xml_diff>
--- a/manual/downloads/docx-customization.docx
+++ b/manual/downloads/docx-customization.docx
@@ -412,7 +412,16 @@
         <w:t xml:space="preserve">A preset file returns a Lua table with the following top-level keys:</w:t>
       </w:r>
     </w:p>
-    <w:bookmarkStart w:id="39329" w:name="listing-src-docx-preset-structure"/>
+    <w:p>
+      <w:pPr>
+        <w:spacing w:line="20" w:before="0" w:lineRule="exact" w:after="0"/>
+        <w:rPr>
+          <w:sz w:val="2"/>
+        </w:rPr>
+      </w:pPr>
+      <w:bookmarkStart w:id="39329" w:name="listing-src-docx-preset-structure"/>
+      <w:bookmarkEnd w:id="39329"/>
+    </w:p>
     <w:p>
       <w:pPr>
         <w:pStyle w:val="Caption"/>
@@ -1585,7 +1594,6 @@
         <w:t xml:space="preserve">}</w:t>
       </w:r>
     </w:p>
-    <w:bookmarkEnd w:id="39329"/>
     <w:bookmarkEnd w:id="23"/>
     <w:bookmarkStart w:id="24" w:name="paragraph-style-fields"/>
     <w:p>
@@ -1600,7 +1608,16 @@
         <w:t xml:space="preserve">Paragraph Style Fields</w:t>
       </w:r>
     </w:p>
-    <w:bookmarkStart w:id="94716" w:name="csv-tbl-docx-paragraph-style"/>
+    <w:p>
+      <w:pPr>
+        <w:spacing w:line="20" w:before="0" w:lineRule="exact" w:after="0"/>
+        <w:rPr>
+          <w:sz w:val="2"/>
+        </w:rPr>
+      </w:pPr>
+      <w:bookmarkStart w:id="94716" w:name="csv-tbl-docx-paragraph-style"/>
+      <w:bookmarkEnd w:id="94716"/>
+    </w:p>
     <w:p>
       <w:pPr>
         <w:pStyle w:val="Caption"/>
@@ -1634,18 +1651,18 @@
         <w:tblW w:type="auto" w:w="0"/>
         <w:tblLook w:firstRow="1" w:lastRow="0" w:firstColumn="0" w:lastColumn="0" w:noHBand="0" w:noVBand="0" w:val="0020"/>
         <w:tblBorders>
-          <w:top w:color="000000" w:sz="6" w:space="0" w:val="single"/>
-          <w:left w:color="000000" w:sz="6" w:space="0" w:val="single"/>
-          <w:bottom w:color="000000" w:sz="6" w:space="0" w:val="single"/>
-          <w:right w:color="000000" w:sz="6" w:space="0" w:val="single"/>
-          <w:insideH w:color="000000" w:sz="6" w:space="0" w:val="single"/>
-          <w:insideV w:color="000000" w:sz="6" w:space="0" w:val="single"/>
+          <w:top w:val="single" w:space="0" w:color="000000" w:sz="6"/>
+          <w:left w:val="single" w:space="0" w:color="000000" w:sz="6"/>
+          <w:bottom w:val="single" w:space="0" w:color="000000" w:sz="6"/>
+          <w:right w:val="single" w:space="0" w:color="000000" w:sz="6"/>
+          <w:insideH w:val="single" w:space="0" w:color="000000" w:sz="6"/>
+          <w:insideV w:val="single" w:space="0" w:color="000000" w:sz="6"/>
         </w:tblBorders>
         <w:tblCellMar>
-          <w:top w:w="57" w:type="dxa"/>
-          <w:left w:w="108" w:type="dxa"/>
-          <w:bottom w:w="57" w:type="dxa"/>
-          <w:right w:w="108" w:type="dxa"/>
+          <w:top w:type="dxa" w:w="57"/>
+          <w:left w:type="dxa" w:w="108"/>
+          <w:bottom w:type="dxa" w:w="57"/>
+          <w:right w:type="dxa" w:w="108"/>
         </w:tblCellMar>
       </w:tblPr>
       <w:tblGrid>
@@ -1660,14 +1677,14 @@
         </w:trPr>
         <w:tc>
           <w:tcPr>
-            <w:shd w:color="auto" w:fill="E8E8E8" w:val="clear"/>
+            <w:shd w:val="clear" w:color="auto" w:fill="E8E8E8"/>
           </w:tcPr>
           <w:p>
             <w:pPr>
               <w:pStyle w:val="Compact"/>
               <w:jc w:val="left"/>
-              <w:ind w:right="0" w:firstLine="0" w:left="0"/>
-              <w:spacing w:lineRule="auto" w:after="40" w:line="240" w:before="40"/>
+              <w:ind w:firstLine="0" w:left="0" w:right="0"/>
+              <w:spacing w:after="40" w:before="40" w:lineRule="auto" w:line="240"/>
             </w:pPr>
             <w:r>
               <w:rPr>
@@ -1679,14 +1696,14 @@
         </w:tc>
         <w:tc>
           <w:tcPr>
-            <w:shd w:color="auto" w:fill="E8E8E8" w:val="clear"/>
+            <w:shd w:val="clear" w:color="auto" w:fill="E8E8E8"/>
           </w:tcPr>
           <w:p>
             <w:pPr>
               <w:pStyle w:val="Compact"/>
               <w:jc w:val="left"/>
-              <w:ind w:right="0" w:firstLine="0" w:left="0"/>
-              <w:spacing w:lineRule="auto" w:after="40" w:line="240" w:before="40"/>
+              <w:ind w:firstLine="0" w:left="0" w:right="0"/>
+              <w:spacing w:after="40" w:before="40" w:lineRule="auto" w:line="240"/>
             </w:pPr>
             <w:r>
               <w:rPr>
@@ -1698,14 +1715,14 @@
         </w:tc>
         <w:tc>
           <w:tcPr>
-            <w:shd w:color="auto" w:fill="E8E8E8" w:val="clear"/>
+            <w:shd w:val="clear" w:color="auto" w:fill="E8E8E8"/>
           </w:tcPr>
           <w:p>
             <w:pPr>
               <w:pStyle w:val="Compact"/>
               <w:jc w:val="left"/>
-              <w:ind w:right="0" w:firstLine="0" w:left="0"/>
-              <w:spacing w:lineRule="auto" w:after="40" w:line="240" w:before="40"/>
+              <w:ind w:firstLine="0" w:left="0" w:right="0"/>
+              <w:spacing w:after="40" w:before="40" w:lineRule="auto" w:line="240"/>
             </w:pPr>
             <w:r>
               <w:rPr>
@@ -1717,14 +1734,14 @@
         </w:tc>
         <w:tc>
           <w:tcPr>
-            <w:shd w:color="auto" w:fill="E8E8E8" w:val="clear"/>
+            <w:shd w:val="clear" w:color="auto" w:fill="E8E8E8"/>
           </w:tcPr>
           <w:p>
             <w:pPr>
               <w:pStyle w:val="Compact"/>
               <w:jc w:val="left"/>
-              <w:ind w:right="0" w:firstLine="0" w:left="0"/>
-              <w:spacing w:lineRule="auto" w:after="40" w:line="240" w:before="40"/>
+              <w:ind w:firstLine="0" w:left="0" w:right="0"/>
+              <w:spacing w:after="40" w:before="40" w:lineRule="auto" w:line="240"/>
             </w:pPr>
             <w:r>
               <w:rPr>
@@ -1742,8 +1759,8 @@
             <w:pPr>
               <w:pStyle w:val="Compact"/>
               <w:jc w:val="left"/>
-              <w:ind w:right="0" w:firstLine="0" w:left="0"/>
-              <w:spacing w:lineRule="auto" w:after="40" w:line="240" w:before="40"/>
+              <w:ind w:firstLine="0" w:left="0" w:right="0"/>
+              <w:spacing w:after="40" w:before="40" w:lineRule="auto" w:line="240"/>
             </w:pPr>
             <w:r>
               <w:rPr>
@@ -1759,8 +1776,8 @@
             <w:pPr>
               <w:pStyle w:val="Compact"/>
               <w:jc w:val="left"/>
-              <w:ind w:right="0" w:firstLine="0" w:left="0"/>
-              <w:spacing w:lineRule="auto" w:after="40" w:line="240" w:before="40"/>
+              <w:ind w:firstLine="0" w:left="0" w:right="0"/>
+              <w:spacing w:after="40" w:before="40" w:lineRule="auto" w:line="240"/>
             </w:pPr>
             <w:r>
               <w:t xml:space="preserve">string</w:t>
@@ -1773,8 +1790,8 @@
             <w:pPr>
               <w:pStyle w:val="Compact"/>
               <w:jc w:val="left"/>
-              <w:ind w:right="0" w:firstLine="0" w:left="0"/>
-              <w:spacing w:lineRule="auto" w:after="40" w:line="240" w:before="40"/>
+              <w:ind w:firstLine="0" w:left="0" w:right="0"/>
+              <w:spacing w:after="40" w:before="40" w:lineRule="auto" w:line="240"/>
             </w:pPr>
             <w:r>
               <w:t xml:space="preserve">required</w:t>
@@ -1787,8 +1804,8 @@
             <w:pPr>
               <w:pStyle w:val="Compact"/>
               <w:jc w:val="left"/>
-              <w:ind w:right="0" w:firstLine="0" w:left="0"/>
-              <w:spacing w:lineRule="auto" w:after="40" w:line="240" w:before="40"/>
+              <w:ind w:firstLine="0" w:left="0" w:right="0"/>
+              <w:spacing w:after="40" w:before="40" w:lineRule="auto" w:line="240"/>
             </w:pPr>
             <w:r>
               <w:t xml:space="preserve">Internal style ID (e.g.,</w:t>
@@ -1812,8 +1829,8 @@
             <w:pPr>
               <w:pStyle w:val="Compact"/>
               <w:jc w:val="left"/>
-              <w:ind w:right="0" w:firstLine="0" w:left="0"/>
-              <w:spacing w:lineRule="auto" w:after="40" w:line="240" w:before="40"/>
+              <w:ind w:firstLine="0" w:left="0" w:right="0"/>
+              <w:spacing w:after="40" w:before="40" w:lineRule="auto" w:line="240"/>
             </w:pPr>
             <w:r>
               <w:rPr>
@@ -1829,8 +1846,8 @@
             <w:pPr>
               <w:pStyle w:val="Compact"/>
               <w:jc w:val="left"/>
-              <w:ind w:right="0" w:firstLine="0" w:left="0"/>
-              <w:spacing w:lineRule="auto" w:after="40" w:line="240" w:before="40"/>
+              <w:ind w:firstLine="0" w:left="0" w:right="0"/>
+              <w:spacing w:after="40" w:before="40" w:lineRule="auto" w:line="240"/>
             </w:pPr>
             <w:r>
               <w:t xml:space="preserve">string</w:t>
@@ -1843,8 +1860,8 @@
             <w:pPr>
               <w:pStyle w:val="Compact"/>
               <w:jc w:val="left"/>
-              <w:ind w:right="0" w:firstLine="0" w:left="0"/>
-              <w:spacing w:lineRule="auto" w:after="40" w:line="240" w:before="40"/>
+              <w:ind w:firstLine="0" w:left="0" w:right="0"/>
+              <w:spacing w:after="40" w:before="40" w:lineRule="auto" w:line="240"/>
             </w:pPr>
             <w:r>
               <w:t xml:space="preserve">required</w:t>
@@ -1857,8 +1874,8 @@
             <w:pPr>
               <w:pStyle w:val="Compact"/>
               <w:jc w:val="left"/>
-              <w:ind w:right="0" w:firstLine="0" w:left="0"/>
-              <w:spacing w:lineRule="auto" w:after="40" w:line="240" w:before="40"/>
+              <w:ind w:firstLine="0" w:left="0" w:right="0"/>
+              <w:spacing w:after="40" w:before="40" w:lineRule="auto" w:line="240"/>
             </w:pPr>
             <w:r>
               <w:t xml:space="preserve">Display name in Word (e.g.,</w:t>
@@ -1882,8 +1899,8 @@
             <w:pPr>
               <w:pStyle w:val="Compact"/>
               <w:jc w:val="left"/>
-              <w:ind w:right="0" w:firstLine="0" w:left="0"/>
-              <w:spacing w:lineRule="auto" w:after="40" w:line="240" w:before="40"/>
+              <w:ind w:firstLine="0" w:left="0" w:right="0"/>
+              <w:spacing w:after="40" w:before="40" w:lineRule="auto" w:line="240"/>
             </w:pPr>
             <w:r>
               <w:rPr>
@@ -1899,8 +1916,8 @@
             <w:pPr>
               <w:pStyle w:val="Compact"/>
               <w:jc w:val="left"/>
-              <w:ind w:right="0" w:firstLine="0" w:left="0"/>
-              <w:spacing w:lineRule="auto" w:after="40" w:line="240" w:before="40"/>
+              <w:ind w:firstLine="0" w:left="0" w:right="0"/>
+              <w:spacing w:after="40" w:before="40" w:lineRule="auto" w:line="240"/>
             </w:pPr>
             <w:r>
               <w:t xml:space="preserve">string</w:t>
@@ -1913,8 +1930,8 @@
             <w:pPr>
               <w:pStyle w:val="Compact"/>
               <w:jc w:val="left"/>
-              <w:ind w:right="0" w:firstLine="0" w:left="0"/>
-              <w:spacing w:lineRule="auto" w:after="40" w:line="240" w:before="40"/>
+              <w:ind w:firstLine="0" w:left="0" w:right="0"/>
+              <w:spacing w:after="40" w:before="40" w:lineRule="auto" w:line="240"/>
             </w:pPr>
             <w:r>
               <w:t xml:space="preserve">nil</w:t>
@@ -1927,8 +1944,8 @@
             <w:pPr>
               <w:pStyle w:val="Compact"/>
               <w:jc w:val="left"/>
-              <w:ind w:right="0" w:firstLine="0" w:left="0"/>
-              <w:spacing w:lineRule="auto" w:after="40" w:line="240" w:before="40"/>
+              <w:ind w:firstLine="0" w:left="0" w:right="0"/>
+              <w:spacing w:after="40" w:before="40" w:lineRule="auto" w:line="240"/>
             </w:pPr>
             <w:r>
               <w:t xml:space="preserve">Parent style ID for inheritance</w:t>
@@ -1943,8 +1960,8 @@
             <w:pPr>
               <w:pStyle w:val="Compact"/>
               <w:jc w:val="left"/>
-              <w:ind w:right="0" w:firstLine="0" w:left="0"/>
-              <w:spacing w:lineRule="auto" w:after="40" w:line="240" w:before="40"/>
+              <w:ind w:firstLine="0" w:left="0" w:right="0"/>
+              <w:spacing w:after="40" w:before="40" w:lineRule="auto" w:line="240"/>
             </w:pPr>
             <w:r>
               <w:rPr>
@@ -1960,8 +1977,8 @@
             <w:pPr>
               <w:pStyle w:val="Compact"/>
               <w:jc w:val="left"/>
-              <w:ind w:right="0" w:firstLine="0" w:left="0"/>
-              <w:spacing w:lineRule="auto" w:after="40" w:line="240" w:before="40"/>
+              <w:ind w:firstLine="0" w:left="0" w:right="0"/>
+              <w:spacing w:after="40" w:before="40" w:lineRule="auto" w:line="240"/>
             </w:pPr>
             <w:r>
               <w:t xml:space="preserve">string</w:t>
@@ -1974,8 +1991,8 @@
             <w:pPr>
               <w:pStyle w:val="Compact"/>
               <w:jc w:val="left"/>
-              <w:ind w:right="0" w:firstLine="0" w:left="0"/>
-              <w:spacing w:lineRule="auto" w:after="40" w:line="240" w:before="40"/>
+              <w:ind w:firstLine="0" w:left="0" w:right="0"/>
+              <w:spacing w:after="40" w:before="40" w:lineRule="auto" w:line="240"/>
             </w:pPr>
             <w:r>
               <w:t xml:space="preserve">nil</w:t>
@@ -1988,8 +2005,8 @@
             <w:pPr>
               <w:pStyle w:val="Compact"/>
               <w:jc w:val="left"/>
-              <w:ind w:right="0" w:firstLine="0" w:left="0"/>
-              <w:spacing w:lineRule="auto" w:after="40" w:line="240" w:before="40"/>
+              <w:ind w:firstLine="0" w:left="0" w:right="0"/>
+              <w:spacing w:after="40" w:before="40" w:lineRule="auto" w:line="240"/>
             </w:pPr>
             <w:r>
               <w:t xml:space="preserve">Style to apply to the next paragraph</w:t>
@@ -2004,8 +2021,8 @@
             <w:pPr>
               <w:pStyle w:val="Compact"/>
               <w:jc w:val="left"/>
-              <w:ind w:right="0" w:firstLine="0" w:left="0"/>
-              <w:spacing w:lineRule="auto" w:after="40" w:line="240" w:before="40"/>
+              <w:ind w:firstLine="0" w:left="0" w:right="0"/>
+              <w:spacing w:after="40" w:before="40" w:lineRule="auto" w:line="240"/>
             </w:pPr>
             <w:r>
               <w:rPr>
@@ -2021,8 +2038,8 @@
             <w:pPr>
               <w:pStyle w:val="Compact"/>
               <w:jc w:val="left"/>
-              <w:ind w:right="0" w:firstLine="0" w:left="0"/>
-              <w:spacing w:lineRule="auto" w:after="40" w:line="240" w:before="40"/>
+              <w:ind w:firstLine="0" w:left="0" w:right="0"/>
+              <w:spacing w:after="40" w:before="40" w:lineRule="auto" w:line="240"/>
             </w:pPr>
             <w:r>
               <w:t xml:space="preserve">string</w:t>
@@ -2035,8 +2052,8 @@
             <w:pPr>
               <w:pStyle w:val="Compact"/>
               <w:jc w:val="left"/>
-              <w:ind w:right="0" w:firstLine="0" w:left="0"/>
-              <w:spacing w:lineRule="auto" w:after="40" w:line="240" w:before="40"/>
+              <w:ind w:firstLine="0" w:left="0" w:right="0"/>
+              <w:spacing w:after="40" w:before="40" w:lineRule="auto" w:line="240"/>
             </w:pPr>
             <w:r>
               <w:t xml:space="preserve">nil</w:t>
@@ -2049,8 +2066,8 @@
             <w:pPr>
               <w:pStyle w:val="Compact"/>
               <w:jc w:val="left"/>
-              <w:ind w:right="0" w:firstLine="0" w:left="0"/>
-              <w:spacing w:lineRule="auto" w:after="40" w:line="240" w:before="40"/>
+              <w:ind w:firstLine="0" w:left="0" w:right="0"/>
+              <w:spacing w:after="40" w:before="40" w:lineRule="auto" w:line="240"/>
             </w:pPr>
             <w:r>
               <w:t xml:space="preserve">Font family name</w:t>
@@ -2065,8 +2082,8 @@
             <w:pPr>
               <w:pStyle w:val="Compact"/>
               <w:jc w:val="left"/>
-              <w:ind w:right="0" w:firstLine="0" w:left="0"/>
-              <w:spacing w:lineRule="auto" w:after="40" w:line="240" w:before="40"/>
+              <w:ind w:firstLine="0" w:left="0" w:right="0"/>
+              <w:spacing w:after="40" w:before="40" w:lineRule="auto" w:line="240"/>
             </w:pPr>
             <w:r>
               <w:rPr>
@@ -2082,8 +2099,8 @@
             <w:pPr>
               <w:pStyle w:val="Compact"/>
               <w:jc w:val="left"/>
-              <w:ind w:right="0" w:firstLine="0" w:left="0"/>
-              <w:spacing w:lineRule="auto" w:after="40" w:line="240" w:before="40"/>
+              <w:ind w:firstLine="0" w:left="0" w:right="0"/>
+              <w:spacing w:after="40" w:before="40" w:lineRule="auto" w:line="240"/>
             </w:pPr>
             <w:r>
               <w:t xml:space="preserve">number</w:t>
@@ -2096,8 +2113,8 @@
             <w:pPr>
               <w:pStyle w:val="Compact"/>
               <w:jc w:val="left"/>
-              <w:ind w:right="0" w:firstLine="0" w:left="0"/>
-              <w:spacing w:lineRule="auto" w:after="40" w:line="240" w:before="40"/>
+              <w:ind w:firstLine="0" w:left="0" w:right="0"/>
+              <w:spacing w:after="40" w:before="40" w:lineRule="auto" w:line="240"/>
             </w:pPr>
             <w:r>
               <w:t xml:space="preserve">nil</w:t>
@@ -2110,8 +2127,8 @@
             <w:pPr>
               <w:pStyle w:val="Compact"/>
               <w:jc w:val="left"/>
-              <w:ind w:right="0" w:firstLine="0" w:left="0"/>
-              <w:spacing w:lineRule="auto" w:after="40" w:line="240" w:before="40"/>
+              <w:ind w:firstLine="0" w:left="0" w:right="0"/>
+              <w:spacing w:after="40" w:before="40" w:lineRule="auto" w:line="240"/>
             </w:pPr>
             <w:r>
               <w:t xml:space="preserve">Font size in points</w:t>
@@ -2126,8 +2143,8 @@
             <w:pPr>
               <w:pStyle w:val="Compact"/>
               <w:jc w:val="left"/>
-              <w:ind w:right="0" w:firstLine="0" w:left="0"/>
-              <w:spacing w:lineRule="auto" w:after="40" w:line="240" w:before="40"/>
+              <w:ind w:firstLine="0" w:left="0" w:right="0"/>
+              <w:spacing w:after="40" w:before="40" w:lineRule="auto" w:line="240"/>
             </w:pPr>
             <w:r>
               <w:rPr>
@@ -2143,8 +2160,8 @@
             <w:pPr>
               <w:pStyle w:val="Compact"/>
               <w:jc w:val="left"/>
-              <w:ind w:right="0" w:firstLine="0" w:left="0"/>
-              <w:spacing w:lineRule="auto" w:after="40" w:line="240" w:before="40"/>
+              <w:ind w:firstLine="0" w:left="0" w:right="0"/>
+              <w:spacing w:after="40" w:before="40" w:lineRule="auto" w:line="240"/>
             </w:pPr>
             <w:r>
               <w:t xml:space="preserve">string</w:t>
@@ -2157,8 +2174,8 @@
             <w:pPr>
               <w:pStyle w:val="Compact"/>
               <w:jc w:val="left"/>
-              <w:ind w:right="0" w:firstLine="0" w:left="0"/>
-              <w:spacing w:lineRule="auto" w:after="40" w:line="240" w:before="40"/>
+              <w:ind w:firstLine="0" w:left="0" w:right="0"/>
+              <w:spacing w:after="40" w:before="40" w:lineRule="auto" w:line="240"/>
             </w:pPr>
             <w:r>
               <w:t xml:space="preserve">nil</w:t>
@@ -2171,8 +2188,8 @@
             <w:pPr>
               <w:pStyle w:val="Compact"/>
               <w:jc w:val="left"/>
-              <w:ind w:right="0" w:firstLine="0" w:left="0"/>
-              <w:spacing w:lineRule="auto" w:after="40" w:line="240" w:before="40"/>
+              <w:ind w:firstLine="0" w:left="0" w:right="0"/>
+              <w:spacing w:after="40" w:before="40" w:lineRule="auto" w:line="240"/>
             </w:pPr>
             <w:r>
               <w:t xml:space="preserve">Hex color without</w:t>
@@ -2211,8 +2228,8 @@
             <w:pPr>
               <w:pStyle w:val="Compact"/>
               <w:jc w:val="left"/>
-              <w:ind w:right="0" w:firstLine="0" w:left="0"/>
-              <w:spacing w:lineRule="auto" w:after="40" w:line="240" w:before="40"/>
+              <w:ind w:firstLine="0" w:left="0" w:right="0"/>
+              <w:spacing w:after="40" w:before="40" w:lineRule="auto" w:line="240"/>
             </w:pPr>
             <w:r>
               <w:rPr>
@@ -2228,8 +2245,8 @@
             <w:pPr>
               <w:pStyle w:val="Compact"/>
               <w:jc w:val="left"/>
-              <w:ind w:right="0" w:firstLine="0" w:left="0"/>
-              <w:spacing w:lineRule="auto" w:after="40" w:line="240" w:before="40"/>
+              <w:ind w:firstLine="0" w:left="0" w:right="0"/>
+              <w:spacing w:after="40" w:before="40" w:lineRule="auto" w:line="240"/>
             </w:pPr>
             <w:r>
               <w:t xml:space="preserve">boolean</w:t>
@@ -2242,8 +2259,8 @@
             <w:pPr>
               <w:pStyle w:val="Compact"/>
               <w:jc w:val="left"/>
-              <w:ind w:right="0" w:firstLine="0" w:left="0"/>
-              <w:spacing w:lineRule="auto" w:after="40" w:line="240" w:before="40"/>
+              <w:ind w:firstLine="0" w:left="0" w:right="0"/>
+              <w:spacing w:after="40" w:before="40" w:lineRule="auto" w:line="240"/>
             </w:pPr>
             <w:r>
               <w:t xml:space="preserve">nil</w:t>
@@ -2256,8 +2273,8 @@
             <w:pPr>
               <w:pStyle w:val="Compact"/>
               <w:jc w:val="left"/>
-              <w:ind w:right="0" w:firstLine="0" w:left="0"/>
-              <w:spacing w:lineRule="auto" w:after="40" w:line="240" w:before="40"/>
+              <w:ind w:firstLine="0" w:left="0" w:right="0"/>
+              <w:spacing w:after="40" w:before="40" w:lineRule="auto" w:line="240"/>
             </w:pPr>
             <w:r>
               <w:t xml:space="preserve">Bold text</w:t>
@@ -2272,8 +2289,8 @@
             <w:pPr>
               <w:pStyle w:val="Compact"/>
               <w:jc w:val="left"/>
-              <w:ind w:right="0" w:firstLine="0" w:left="0"/>
-              <w:spacing w:lineRule="auto" w:after="40" w:line="240" w:before="40"/>
+              <w:ind w:firstLine="0" w:left="0" w:right="0"/>
+              <w:spacing w:after="40" w:before="40" w:lineRule="auto" w:line="240"/>
             </w:pPr>
             <w:r>
               <w:rPr>
@@ -2289,8 +2306,8 @@
             <w:pPr>
               <w:pStyle w:val="Compact"/>
               <w:jc w:val="left"/>
-              <w:ind w:right="0" w:firstLine="0" w:left="0"/>
-              <w:spacing w:lineRule="auto" w:after="40" w:line="240" w:before="40"/>
+              <w:ind w:firstLine="0" w:left="0" w:right="0"/>
+              <w:spacing w:after="40" w:before="40" w:lineRule="auto" w:line="240"/>
             </w:pPr>
             <w:r>
               <w:t xml:space="preserve">boolean</w:t>
@@ -2303,8 +2320,8 @@
             <w:pPr>
               <w:pStyle w:val="Compact"/>
               <w:jc w:val="left"/>
-              <w:ind w:right="0" w:firstLine="0" w:left="0"/>
-              <w:spacing w:lineRule="auto" w:after="40" w:line="240" w:before="40"/>
+              <w:ind w:firstLine="0" w:left="0" w:right="0"/>
+              <w:spacing w:after="40" w:before="40" w:lineRule="auto" w:line="240"/>
             </w:pPr>
             <w:r>
               <w:t xml:space="preserve">nil</w:t>
@@ -2317,8 +2334,8 @@
             <w:pPr>
               <w:pStyle w:val="Compact"/>
               <w:jc w:val="left"/>
-              <w:ind w:right="0" w:firstLine="0" w:left="0"/>
-              <w:spacing w:lineRule="auto" w:after="40" w:line="240" w:before="40"/>
+              <w:ind w:firstLine="0" w:left="0" w:right="0"/>
+              <w:spacing w:after="40" w:before="40" w:lineRule="auto" w:line="240"/>
             </w:pPr>
             <w:r>
               <w:t xml:space="preserve">Italic text</w:t>
@@ -2333,8 +2350,8 @@
             <w:pPr>
               <w:pStyle w:val="Compact"/>
               <w:jc w:val="left"/>
-              <w:ind w:right="0" w:firstLine="0" w:left="0"/>
-              <w:spacing w:lineRule="auto" w:after="40" w:line="240" w:before="40"/>
+              <w:ind w:firstLine="0" w:left="0" w:right="0"/>
+              <w:spacing w:after="40" w:before="40" w:lineRule="auto" w:line="240"/>
             </w:pPr>
             <w:r>
               <w:rPr>
@@ -2350,8 +2367,8 @@
             <w:pPr>
               <w:pStyle w:val="Compact"/>
               <w:jc w:val="left"/>
-              <w:ind w:right="0" w:firstLine="0" w:left="0"/>
-              <w:spacing w:lineRule="auto" w:after="40" w:line="240" w:before="40"/>
+              <w:ind w:firstLine="0" w:left="0" w:right="0"/>
+              <w:spacing w:after="40" w:before="40" w:lineRule="auto" w:line="240"/>
             </w:pPr>
             <w:r>
               <w:t xml:space="preserve">number</w:t>
@@ -2364,8 +2381,8 @@
             <w:pPr>
               <w:pStyle w:val="Compact"/>
               <w:jc w:val="left"/>
-              <w:ind w:right="0" w:firstLine="0" w:left="0"/>
-              <w:spacing w:lineRule="auto" w:after="40" w:line="240" w:before="40"/>
+              <w:ind w:firstLine="0" w:left="0" w:right="0"/>
+              <w:spacing w:after="40" w:before="40" w:lineRule="auto" w:line="240"/>
             </w:pPr>
             <w:r>
               <w:t xml:space="preserve">nil</w:t>
@@ -2378,8 +2395,8 @@
             <w:pPr>
               <w:pStyle w:val="Compact"/>
               <w:jc w:val="left"/>
-              <w:ind w:right="0" w:firstLine="0" w:left="0"/>
-              <w:spacing w:lineRule="auto" w:after="40" w:line="240" w:before="40"/>
+              <w:ind w:firstLine="0" w:left="0" w:right="0"/>
+              <w:spacing w:after="40" w:before="40" w:lineRule="auto" w:line="240"/>
             </w:pPr>
             <w:r>
               <w:t xml:space="preserve">Line spacing multiplier (1.0 = single, 1.15, 2.0, etc.)</w:t>
@@ -2394,8 +2411,8 @@
             <w:pPr>
               <w:pStyle w:val="Compact"/>
               <w:jc w:val="left"/>
-              <w:ind w:right="0" w:firstLine="0" w:left="0"/>
-              <w:spacing w:lineRule="auto" w:after="40" w:line="240" w:before="40"/>
+              <w:ind w:firstLine="0" w:left="0" w:right="0"/>
+              <w:spacing w:after="40" w:before="40" w:lineRule="auto" w:line="240"/>
             </w:pPr>
             <w:r>
               <w:rPr>
@@ -2411,8 +2428,8 @@
             <w:pPr>
               <w:pStyle w:val="Compact"/>
               <w:jc w:val="left"/>
-              <w:ind w:right="0" w:firstLine="0" w:left="0"/>
-              <w:spacing w:lineRule="auto" w:after="40" w:line="240" w:before="40"/>
+              <w:ind w:firstLine="0" w:left="0" w:right="0"/>
+              <w:spacing w:after="40" w:before="40" w:lineRule="auto" w:line="240"/>
             </w:pPr>
             <w:r>
               <w:t xml:space="preserve">number</w:t>
@@ -2425,8 +2442,8 @@
             <w:pPr>
               <w:pStyle w:val="Compact"/>
               <w:jc w:val="left"/>
-              <w:ind w:right="0" w:firstLine="0" w:left="0"/>
-              <w:spacing w:lineRule="auto" w:after="40" w:line="240" w:before="40"/>
+              <w:ind w:firstLine="0" w:left="0" w:right="0"/>
+              <w:spacing w:after="40" w:before="40" w:lineRule="auto" w:line="240"/>
             </w:pPr>
             <w:r>
               <w:t xml:space="preserve">nil</w:t>
@@ -2439,8 +2456,8 @@
             <w:pPr>
               <w:pStyle w:val="Compact"/>
               <w:jc w:val="left"/>
-              <w:ind w:right="0" w:firstLine="0" w:left="0"/>
-              <w:spacing w:lineRule="auto" w:after="40" w:line="240" w:before="40"/>
+              <w:ind w:firstLine="0" w:left="0" w:right="0"/>
+              <w:spacing w:after="40" w:before="40" w:lineRule="auto" w:line="240"/>
             </w:pPr>
             <w:r>
               <w:t xml:space="preserve">Space before paragraph in points</w:t>
@@ -2455,8 +2472,8 @@
             <w:pPr>
               <w:pStyle w:val="Compact"/>
               <w:jc w:val="left"/>
-              <w:ind w:right="0" w:firstLine="0" w:left="0"/>
-              <w:spacing w:lineRule="auto" w:after="40" w:line="240" w:before="40"/>
+              <w:ind w:firstLine="0" w:left="0" w:right="0"/>
+              <w:spacing w:after="40" w:before="40" w:lineRule="auto" w:line="240"/>
             </w:pPr>
             <w:r>
               <w:rPr>
@@ -2472,8 +2489,8 @@
             <w:pPr>
               <w:pStyle w:val="Compact"/>
               <w:jc w:val="left"/>
-              <w:ind w:right="0" w:firstLine="0" w:left="0"/>
-              <w:spacing w:lineRule="auto" w:after="40" w:line="240" w:before="40"/>
+              <w:ind w:firstLine="0" w:left="0" w:right="0"/>
+              <w:spacing w:after="40" w:before="40" w:lineRule="auto" w:line="240"/>
             </w:pPr>
             <w:r>
               <w:t xml:space="preserve">number</w:t>
@@ -2486,8 +2503,8 @@
             <w:pPr>
               <w:pStyle w:val="Compact"/>
               <w:jc w:val="left"/>
-              <w:ind w:right="0" w:firstLine="0" w:left="0"/>
-              <w:spacing w:lineRule="auto" w:after="40" w:line="240" w:before="40"/>
+              <w:ind w:firstLine="0" w:left="0" w:right="0"/>
+              <w:spacing w:after="40" w:before="40" w:lineRule="auto" w:line="240"/>
             </w:pPr>
             <w:r>
               <w:t xml:space="preserve">nil</w:t>
@@ -2500,8 +2517,8 @@
             <w:pPr>
               <w:pStyle w:val="Compact"/>
               <w:jc w:val="left"/>
-              <w:ind w:right="0" w:firstLine="0" w:left="0"/>
-              <w:spacing w:lineRule="auto" w:after="40" w:line="240" w:before="40"/>
+              <w:ind w:firstLine="0" w:left="0" w:right="0"/>
+              <w:spacing w:after="40" w:before="40" w:lineRule="auto" w:line="240"/>
             </w:pPr>
             <w:r>
               <w:t xml:space="preserve">Space after paragraph in points</w:t>
@@ -2516,8 +2533,8 @@
             <w:pPr>
               <w:pStyle w:val="Compact"/>
               <w:jc w:val="left"/>
-              <w:ind w:right="0" w:firstLine="0" w:left="0"/>
-              <w:spacing w:lineRule="auto" w:after="40" w:line="240" w:before="40"/>
+              <w:ind w:firstLine="0" w:left="0" w:right="0"/>
+              <w:spacing w:after="40" w:before="40" w:lineRule="auto" w:line="240"/>
             </w:pPr>
             <w:r>
               <w:rPr>
@@ -2533,8 +2550,8 @@
             <w:pPr>
               <w:pStyle w:val="Compact"/>
               <w:jc w:val="left"/>
-              <w:ind w:right="0" w:firstLine="0" w:left="0"/>
-              <w:spacing w:lineRule="auto" w:after="40" w:line="240" w:before="40"/>
+              <w:ind w:firstLine="0" w:left="0" w:right="0"/>
+              <w:spacing w:after="40" w:before="40" w:lineRule="auto" w:line="240"/>
             </w:pPr>
             <w:r>
               <w:t xml:space="preserve">string</w:t>
@@ -2547,8 +2564,8 @@
             <w:pPr>
               <w:pStyle w:val="Compact"/>
               <w:jc w:val="left"/>
-              <w:ind w:right="0" w:firstLine="0" w:left="0"/>
-              <w:spacing w:lineRule="auto" w:after="40" w:line="240" w:before="40"/>
+              <w:ind w:firstLine="0" w:left="0" w:right="0"/>
+              <w:spacing w:after="40" w:before="40" w:lineRule="auto" w:line="240"/>
             </w:pPr>
             <w:r>
               <w:t xml:space="preserve">nil</w:t>
@@ -2561,8 +2578,8 @@
             <w:pPr>
               <w:pStyle w:val="Compact"/>
               <w:jc w:val="left"/>
-              <w:ind w:right="0" w:firstLine="0" w:left="0"/>
-              <w:spacing w:lineRule="auto" w:after="40" w:line="240" w:before="40"/>
+              <w:ind w:firstLine="0" w:left="0" w:right="0"/>
+              <w:spacing w:after="40" w:before="40" w:lineRule="auto" w:line="240"/>
             </w:pPr>
             <w:r>
               <w:t xml:space="preserve">Text alignment:</w:t>
@@ -2616,8 +2633,8 @@
             <w:pPr>
               <w:pStyle w:val="Compact"/>
               <w:jc w:val="left"/>
-              <w:ind w:right="0" w:firstLine="0" w:left="0"/>
-              <w:spacing w:lineRule="auto" w:after="40" w:line="240" w:before="40"/>
+              <w:ind w:firstLine="0" w:left="0" w:right="0"/>
+              <w:spacing w:after="40" w:before="40" w:lineRule="auto" w:line="240"/>
             </w:pPr>
             <w:r>
               <w:rPr>
@@ -2633,8 +2650,8 @@
             <w:pPr>
               <w:pStyle w:val="Compact"/>
               <w:jc w:val="left"/>
-              <w:ind w:right="0" w:firstLine="0" w:left="0"/>
-              <w:spacing w:lineRule="auto" w:after="40" w:line="240" w:before="40"/>
+              <w:ind w:firstLine="0" w:left="0" w:right="0"/>
+              <w:spacing w:after="40" w:before="40" w:lineRule="auto" w:line="240"/>
             </w:pPr>
             <w:r>
               <w:t xml:space="preserve">string</w:t>
@@ -2647,8 +2664,8 @@
             <w:pPr>
               <w:pStyle w:val="Compact"/>
               <w:jc w:val="left"/>
-              <w:ind w:right="0" w:firstLine="0" w:left="0"/>
-              <w:spacing w:lineRule="auto" w:after="40" w:line="240" w:before="40"/>
+              <w:ind w:firstLine="0" w:left="0" w:right="0"/>
+              <w:spacing w:after="40" w:before="40" w:lineRule="auto" w:line="240"/>
             </w:pPr>
             <w:r>
               <w:t xml:space="preserve">nil</w:t>
@@ -2661,8 +2678,8 @@
             <w:pPr>
               <w:pStyle w:val="Compact"/>
               <w:jc w:val="left"/>
-              <w:ind w:right="0" w:firstLine="0" w:left="0"/>
-              <w:spacing w:lineRule="auto" w:after="40" w:line="240" w:before="40"/>
+              <w:ind w:firstLine="0" w:left="0" w:right="0"/>
+              <w:spacing w:after="40" w:before="40" w:lineRule="auto" w:line="240"/>
             </w:pPr>
             <w:r>
               <w:t xml:space="preserve">Left indent (e.g.,</w:t>
@@ -2695,8 +2712,8 @@
             <w:pPr>
               <w:pStyle w:val="Compact"/>
               <w:jc w:val="left"/>
-              <w:ind w:right="0" w:firstLine="0" w:left="0"/>
-              <w:spacing w:lineRule="auto" w:after="40" w:line="240" w:before="40"/>
+              <w:ind w:firstLine="0" w:left="0" w:right="0"/>
+              <w:spacing w:after="40" w:before="40" w:lineRule="auto" w:line="240"/>
             </w:pPr>
             <w:r>
               <w:rPr>
@@ -2712,8 +2729,8 @@
             <w:pPr>
               <w:pStyle w:val="Compact"/>
               <w:jc w:val="left"/>
-              <w:ind w:right="0" w:firstLine="0" w:left="0"/>
-              <w:spacing w:lineRule="auto" w:after="40" w:line="240" w:before="40"/>
+              <w:ind w:firstLine="0" w:left="0" w:right="0"/>
+              <w:spacing w:after="40" w:before="40" w:lineRule="auto" w:line="240"/>
             </w:pPr>
             <w:r>
               <w:t xml:space="preserve">string</w:t>
@@ -2726,8 +2743,8 @@
             <w:pPr>
               <w:pStyle w:val="Compact"/>
               <w:jc w:val="left"/>
-              <w:ind w:right="0" w:firstLine="0" w:left="0"/>
-              <w:spacing w:lineRule="auto" w:after="40" w:line="240" w:before="40"/>
+              <w:ind w:firstLine="0" w:left="0" w:right="0"/>
+              <w:spacing w:after="40" w:before="40" w:lineRule="auto" w:line="240"/>
             </w:pPr>
             <w:r>
               <w:t xml:space="preserve">nil</w:t>
@@ -2740,8 +2757,8 @@
             <w:pPr>
               <w:pStyle w:val="Compact"/>
               <w:jc w:val="left"/>
-              <w:ind w:right="0" w:firstLine="0" w:left="0"/>
-              <w:spacing w:lineRule="auto" w:after="40" w:line="240" w:before="40"/>
+              <w:ind w:firstLine="0" w:left="0" w:right="0"/>
+              <w:spacing w:after="40" w:before="40" w:lineRule="auto" w:line="240"/>
             </w:pPr>
             <w:r>
               <w:t xml:space="preserve">Right indent</w:t>
@@ -2756,8 +2773,8 @@
             <w:pPr>
               <w:pStyle w:val="Compact"/>
               <w:jc w:val="left"/>
-              <w:ind w:right="0" w:firstLine="0" w:left="0"/>
-              <w:spacing w:lineRule="auto" w:after="40" w:line="240" w:before="40"/>
+              <w:ind w:firstLine="0" w:left="0" w:right="0"/>
+              <w:spacing w:after="40" w:before="40" w:lineRule="auto" w:line="240"/>
             </w:pPr>
             <w:r>
               <w:rPr>
@@ -2773,8 +2790,8 @@
             <w:pPr>
               <w:pStyle w:val="Compact"/>
               <w:jc w:val="left"/>
-              <w:ind w:right="0" w:firstLine="0" w:left="0"/>
-              <w:spacing w:lineRule="auto" w:after="40" w:line="240" w:before="40"/>
+              <w:ind w:firstLine="0" w:left="0" w:right="0"/>
+              <w:spacing w:after="40" w:before="40" w:lineRule="auto" w:line="240"/>
             </w:pPr>
             <w:r>
               <w:t xml:space="preserve">boolean</w:t>
@@ -2787,8 +2804,8 @@
             <w:pPr>
               <w:pStyle w:val="Compact"/>
               <w:jc w:val="left"/>
-              <w:ind w:right="0" w:firstLine="0" w:left="0"/>
-              <w:spacing w:lineRule="auto" w:after="40" w:line="240" w:before="40"/>
+              <w:ind w:firstLine="0" w:left="0" w:right="0"/>
+              <w:spacing w:after="40" w:before="40" w:lineRule="auto" w:line="240"/>
             </w:pPr>
             <w:r>
               <w:t xml:space="preserve">nil</w:t>
@@ -2801,8 +2818,8 @@
             <w:pPr>
               <w:pStyle w:val="Compact"/>
               <w:jc w:val="left"/>
-              <w:ind w:right="0" w:firstLine="0" w:left="0"/>
-              <w:spacing w:lineRule="auto" w:after="40" w:line="240" w:before="40"/>
+              <w:ind w:firstLine="0" w:left="0" w:right="0"/>
+              <w:spacing w:after="40" w:before="40" w:lineRule="auto" w:line="240"/>
             </w:pPr>
             <w:r>
               <w:t xml:space="preserve">Keep with next paragraph (prevent orphaning)</w:t>
@@ -2817,8 +2834,8 @@
             <w:pPr>
               <w:pStyle w:val="Compact"/>
               <w:jc w:val="left"/>
-              <w:ind w:right="0" w:firstLine="0" w:left="0"/>
-              <w:spacing w:lineRule="auto" w:after="40" w:line="240" w:before="40"/>
+              <w:ind w:firstLine="0" w:left="0" w:right="0"/>
+              <w:spacing w:after="40" w:before="40" w:lineRule="auto" w:line="240"/>
             </w:pPr>
             <w:r>
               <w:rPr>
@@ -2834,8 +2851,8 @@
             <w:pPr>
               <w:pStyle w:val="Compact"/>
               <w:jc w:val="left"/>
-              <w:ind w:right="0" w:firstLine="0" w:left="0"/>
-              <w:spacing w:lineRule="auto" w:after="40" w:line="240" w:before="40"/>
+              <w:ind w:firstLine="0" w:left="0" w:right="0"/>
+              <w:spacing w:after="40" w:before="40" w:lineRule="auto" w:line="240"/>
             </w:pPr>
             <w:r>
               <w:t xml:space="preserve">integer</w:t>
@@ -2848,8 +2865,8 @@
             <w:pPr>
               <w:pStyle w:val="Compact"/>
               <w:jc w:val="left"/>
-              <w:ind w:right="0" w:firstLine="0" w:left="0"/>
-              <w:spacing w:lineRule="auto" w:after="40" w:line="240" w:before="40"/>
+              <w:ind w:firstLine="0" w:left="0" w:right="0"/>
+              <w:spacing w:after="40" w:before="40" w:lineRule="auto" w:line="240"/>
             </w:pPr>
             <w:r>
               <w:t xml:space="preserve">nil</w:t>
@@ -2862,8 +2879,8 @@
             <w:pPr>
               <w:pStyle w:val="Compact"/>
               <w:jc w:val="left"/>
-              <w:ind w:right="0" w:firstLine="0" w:left="0"/>
-              <w:spacing w:lineRule="auto" w:after="40" w:line="240" w:before="40"/>
+              <w:ind w:firstLine="0" w:left="0" w:right="0"/>
+              <w:spacing w:after="40" w:before="40" w:lineRule="auto" w:line="240"/>
             </w:pPr>
             <w:r>
               <w:t xml:space="preserve">Outline level for TOC (0 = Heading 1, 1 = Heading 2, etc.)</w:t>
@@ -2872,7 +2889,6 @@
         </w:tc>
       </w:tr>
     </w:tbl>
-    <w:bookmarkEnd w:id="94716"/>
     <w:bookmarkEnd w:id="24"/>
     <w:bookmarkStart w:id="25" w:name="paragraph-style-example"/>
     <w:p>
@@ -2887,7 +2903,16 @@
         <w:t xml:space="preserve">Paragraph Style Example</w:t>
       </w:r>
     </w:p>
-    <w:bookmarkStart w:id="637" w:name="listing-src-docx-paragraph-styles"/>
+    <w:p>
+      <w:pPr>
+        <w:spacing w:line="20" w:before="0" w:lineRule="exact" w:after="0"/>
+        <w:rPr>
+          <w:sz w:val="2"/>
+        </w:rPr>
+      </w:pPr>
+      <w:bookmarkStart w:id="637" w:name="listing-src-docx-paragraph-styles"/>
+      <w:bookmarkEnd w:id="637"/>
+    </w:p>
     <w:p>
       <w:pPr>
         <w:pStyle w:val="Caption"/>
@@ -4531,7 +4556,6 @@
         <w:t xml:space="preserve">}</w:t>
       </w:r>
     </w:p>
-    <w:bookmarkEnd w:id="637"/>
     <w:bookmarkEnd w:id="25"/>
     <w:bookmarkStart w:id="26" w:name="table-styles"/>
     <w:p>
@@ -4546,7 +4570,16 @@
         <w:t xml:space="preserve">Table Styles</w:t>
       </w:r>
     </w:p>
-    <w:bookmarkStart w:id="14557" w:name="listing-src-docx-table-styles"/>
+    <w:p>
+      <w:pPr>
+        <w:spacing w:line="20" w:before="0" w:lineRule="exact" w:after="0"/>
+        <w:rPr>
+          <w:sz w:val="2"/>
+        </w:rPr>
+      </w:pPr>
+      <w:bookmarkStart w:id="14557" w:name="listing-src-docx-table-styles"/>
+      <w:bookmarkEnd w:id="14557"/>
+    </w:p>
     <w:p>
       <w:pPr>
         <w:pStyle w:val="Caption"/>
@@ -6097,7 +6130,6 @@
         <w:t xml:space="preserve">}</w:t>
       </w:r>
     </w:p>
-    <w:bookmarkEnd w:id="14557"/>
     <w:bookmarkEnd w:id="26"/>
     <w:bookmarkStart w:id="27" w:name="caption-configuration"/>
     <w:p>
@@ -6112,7 +6144,16 @@
         <w:t xml:space="preserve">Caption Configuration</w:t>
       </w:r>
     </w:p>
-    <w:bookmarkStart w:id="13321" w:name="listing-src-docx-captions"/>
+    <w:p>
+      <w:pPr>
+        <w:spacing w:line="20" w:before="0" w:lineRule="exact" w:after="0"/>
+        <w:rPr>
+          <w:sz w:val="2"/>
+        </w:rPr>
+      </w:pPr>
+      <w:bookmarkStart w:id="13321" w:name="listing-src-docx-captions"/>
+      <w:bookmarkEnd w:id="13321"/>
+    </w:p>
     <w:p>
       <w:pPr>
         <w:pStyle w:val="Caption"/>
@@ -6886,7 +6927,6 @@
         <w:t xml:space="preserve">}</w:t>
       </w:r>
     </w:p>
-    <w:bookmarkEnd w:id="13321"/>
     <w:bookmarkEnd w:id="27"/>
     <w:bookmarkStart w:id="28" w:name="preset-inheritance"/>
     <w:p>
@@ -6924,7 +6964,16 @@
         <w:t xml:space="preserve">field. The child preset deeply merges with the base, with child values taking precedence:</w:t>
       </w:r>
     </w:p>
-    <w:bookmarkStart w:id="16743" w:name="listing-src-docx-preset-extends"/>
+    <w:p>
+      <w:pPr>
+        <w:spacing w:line="20" w:before="0" w:lineRule="exact" w:after="0"/>
+        <w:rPr>
+          <w:sz w:val="2"/>
+        </w:rPr>
+      </w:pPr>
+      <w:bookmarkStart w:id="16743" w:name="listing-src-docx-preset-extends"/>
+      <w:bookmarkEnd w:id="16743"/>
+    </w:p>
     <w:p>
       <w:pPr>
         <w:pStyle w:val="Caption"/>
@@ -8076,7 +8125,6 @@
         <w:t xml:space="preserve">}</w:t>
       </w:r>
     </w:p>
-    <w:bookmarkEnd w:id="16743"/>
     <w:p>
       <w:pPr>
         <w:pStyle w:val="FirstParagraph"/>
@@ -8353,7 +8401,16 @@
         <w:t xml:space="preserve">A template postprocessor exports functions that are called in sequence:</w:t>
       </w:r>
     </w:p>
-    <w:bookmarkStart w:id="25759" w:name="csv-tbl-docx-postprocessor-hooks"/>
+    <w:p>
+      <w:pPr>
+        <w:spacing w:line="20" w:before="0" w:lineRule="exact" w:after="0"/>
+        <w:rPr>
+          <w:sz w:val="2"/>
+        </w:rPr>
+      </w:pPr>
+      <w:bookmarkStart w:id="25759" w:name="csv-tbl-docx-postprocessor-hooks"/>
+      <w:bookmarkEnd w:id="25759"/>
+    </w:p>
     <w:p>
       <w:pPr>
         <w:pStyle w:val="Caption"/>
@@ -8387,18 +8444,18 @@
         <w:tblW w:type="auto" w:w="0"/>
         <w:tblLook w:firstRow="1" w:lastRow="0" w:firstColumn="0" w:lastColumn="0" w:noHBand="0" w:noVBand="0" w:val="0020"/>
         <w:tblBorders>
-          <w:top w:color="000000" w:sz="6" w:space="0" w:val="single"/>
-          <w:left w:color="000000" w:sz="6" w:space="0" w:val="single"/>
-          <w:bottom w:color="000000" w:sz="6" w:space="0" w:val="single"/>
-          <w:right w:color="000000" w:sz="6" w:space="0" w:val="single"/>
-          <w:insideH w:color="000000" w:sz="6" w:space="0" w:val="single"/>
-          <w:insideV w:color="000000" w:sz="6" w:space="0" w:val="single"/>
+          <w:top w:val="single" w:space="0" w:color="000000" w:sz="6"/>
+          <w:left w:val="single" w:space="0" w:color="000000" w:sz="6"/>
+          <w:bottom w:val="single" w:space="0" w:color="000000" w:sz="6"/>
+          <w:right w:val="single" w:space="0" w:color="000000" w:sz="6"/>
+          <w:insideH w:val="single" w:space="0" w:color="000000" w:sz="6"/>
+          <w:insideV w:val="single" w:space="0" w:color="000000" w:sz="6"/>
         </w:tblBorders>
         <w:tblCellMar>
-          <w:top w:w="57" w:type="dxa"/>
-          <w:left w:w="108" w:type="dxa"/>
-          <w:bottom w:w="57" w:type="dxa"/>
-          <w:right w:w="108" w:type="dxa"/>
+          <w:top w:type="dxa" w:w="57"/>
+          <w:left w:type="dxa" w:w="108"/>
+          <w:bottom w:type="dxa" w:w="57"/>
+          <w:right w:type="dxa" w:w="108"/>
         </w:tblCellMar>
       </w:tblPr>
       <w:tblGrid>
@@ -8412,14 +8469,14 @@
         </w:trPr>
         <w:tc>
           <w:tcPr>
-            <w:shd w:color="auto" w:fill="E8E8E8" w:val="clear"/>
+            <w:shd w:val="clear" w:color="auto" w:fill="E8E8E8"/>
           </w:tcPr>
           <w:p>
             <w:pPr>
               <w:pStyle w:val="Compact"/>
               <w:jc w:val="left"/>
-              <w:ind w:right="0" w:firstLine="0" w:left="0"/>
-              <w:spacing w:lineRule="auto" w:after="40" w:line="240" w:before="40"/>
+              <w:ind w:firstLine="0" w:left="0" w:right="0"/>
+              <w:spacing w:after="40" w:before="40" w:lineRule="auto" w:line="240"/>
             </w:pPr>
             <w:r>
               <w:rPr>
@@ -8431,14 +8488,14 @@
         </w:tc>
         <w:tc>
           <w:tcPr>
-            <w:shd w:color="auto" w:fill="E8E8E8" w:val="clear"/>
+            <w:shd w:val="clear" w:color="auto" w:fill="E8E8E8"/>
           </w:tcPr>
           <w:p>
             <w:pPr>
               <w:pStyle w:val="Compact"/>
               <w:jc w:val="left"/>
-              <w:ind w:right="0" w:firstLine="0" w:left="0"/>
-              <w:spacing w:lineRule="auto" w:after="40" w:line="240" w:before="40"/>
+              <w:ind w:firstLine="0" w:left="0" w:right="0"/>
+              <w:spacing w:after="40" w:before="40" w:lineRule="auto" w:line="240"/>
             </w:pPr>
             <w:r>
               <w:rPr>
@@ -8450,14 +8507,14 @@
         </w:tc>
         <w:tc>
           <w:tcPr>
-            <w:shd w:color="auto" w:fill="E8E8E8" w:val="clear"/>
+            <w:shd w:val="clear" w:color="auto" w:fill="E8E8E8"/>
           </w:tcPr>
           <w:p>
             <w:pPr>
               <w:pStyle w:val="Compact"/>
               <w:jc w:val="left"/>
-              <w:ind w:right="0" w:firstLine="0" w:left="0"/>
-              <w:spacing w:lineRule="auto" w:after="40" w:line="240" w:before="40"/>
+              <w:ind w:firstLine="0" w:left="0" w:right="0"/>
+              <w:spacing w:after="40" w:before="40" w:lineRule="auto" w:line="240"/>
             </w:pPr>
             <w:r>
               <w:rPr>
@@ -8475,8 +8532,8 @@
             <w:pPr>
               <w:pStyle w:val="Compact"/>
               <w:jc w:val="left"/>
-              <w:ind w:right="0" w:firstLine="0" w:left="0"/>
-              <w:spacing w:lineRule="auto" w:after="40" w:line="240" w:before="40"/>
+              <w:ind w:firstLine="0" w:left="0" w:right="0"/>
+              <w:spacing w:after="40" w:before="40" w:lineRule="auto" w:line="240"/>
             </w:pPr>
             <w:r>
               <w:rPr>
@@ -8492,8 +8549,8 @@
             <w:pPr>
               <w:pStyle w:val="Compact"/>
               <w:jc w:val="left"/>
-              <w:ind w:right="0" w:firstLine="0" w:left="0"/>
-              <w:spacing w:lineRule="auto" w:after="40" w:line="240" w:before="40"/>
+              <w:ind w:firstLine="0" w:left="0" w:right="0"/>
+              <w:spacing w:after="40" w:before="40" w:lineRule="auto" w:line="240"/>
             </w:pPr>
             <w:r>
               <w:rPr>
@@ -8515,8 +8572,8 @@
             <w:pPr>
               <w:pStyle w:val="Compact"/>
               <w:jc w:val="left"/>
-              <w:ind w:right="0" w:firstLine="0" w:left="0"/>
-              <w:spacing w:lineRule="auto" w:after="40" w:line="240" w:before="40"/>
+              <w:ind w:firstLine="0" w:left="0" w:right="0"/>
+              <w:spacing w:after="40" w:before="40" w:lineRule="auto" w:line="240"/>
             </w:pPr>
             <w:r>
               <w:t xml:space="preserve">Modify main document body</w:t>
@@ -8531,8 +8588,8 @@
             <w:pPr>
               <w:pStyle w:val="Compact"/>
               <w:jc w:val="left"/>
-              <w:ind w:right="0" w:firstLine="0" w:left="0"/>
-              <w:spacing w:lineRule="auto" w:after="40" w:line="240" w:before="40"/>
+              <w:ind w:firstLine="0" w:left="0" w:right="0"/>
+              <w:spacing w:after="40" w:before="40" w:lineRule="auto" w:line="240"/>
             </w:pPr>
             <w:r>
               <w:rPr>
@@ -8548,8 +8605,8 @@
             <w:pPr>
               <w:pStyle w:val="Compact"/>
               <w:jc w:val="left"/>
-              <w:ind w:right="0" w:firstLine="0" w:left="0"/>
-              <w:spacing w:lineRule="auto" w:after="40" w:line="240" w:before="40"/>
+              <w:ind w:firstLine="0" w:left="0" w:right="0"/>
+              <w:spacing w:after="40" w:before="40" w:lineRule="auto" w:line="240"/>
             </w:pPr>
             <w:r>
               <w:rPr>
@@ -8571,8 +8628,8 @@
             <w:pPr>
               <w:pStyle w:val="Compact"/>
               <w:jc w:val="left"/>
-              <w:ind w:right="0" w:firstLine="0" w:left="0"/>
-              <w:spacing w:lineRule="auto" w:after="40" w:line="240" w:before="40"/>
+              <w:ind w:firstLine="0" w:left="0" w:right="0"/>
+              <w:spacing w:after="40" w:before="40" w:lineRule="auto" w:line="240"/>
             </w:pPr>
             <w:r>
               <w:t xml:space="preserve">Modify or inject style definitions</w:t>
@@ -8587,8 +8644,8 @@
             <w:pPr>
               <w:pStyle w:val="Compact"/>
               <w:jc w:val="left"/>
-              <w:ind w:right="0" w:firstLine="0" w:left="0"/>
-              <w:spacing w:lineRule="auto" w:after="40" w:line="240" w:before="40"/>
+              <w:ind w:firstLine="0" w:left="0" w:right="0"/>
+              <w:spacing w:after="40" w:before="40" w:lineRule="auto" w:line="240"/>
             </w:pPr>
             <w:r>
               <w:rPr>
@@ -8604,8 +8661,8 @@
             <w:pPr>
               <w:pStyle w:val="Compact"/>
               <w:jc w:val="left"/>
-              <w:ind w:right="0" w:firstLine="0" w:left="0"/>
-              <w:spacing w:lineRule="auto" w:after="40" w:line="240" w:before="40"/>
+              <w:ind w:firstLine="0" w:left="0" w:right="0"/>
+              <w:spacing w:after="40" w:before="40" w:lineRule="auto" w:line="240"/>
             </w:pPr>
             <w:r>
               <w:rPr>
@@ -8627,8 +8684,8 @@
             <w:pPr>
               <w:pStyle w:val="Compact"/>
               <w:jc w:val="left"/>
-              <w:ind w:right="0" w:firstLine="0" w:left="0"/>
-              <w:spacing w:lineRule="auto" w:after="40" w:line="240" w:before="40"/>
+              <w:ind w:firstLine="0" w:left="0" w:right="0"/>
+              <w:spacing w:after="40" w:before="40" w:lineRule="auto" w:line="240"/>
             </w:pPr>
             <w:r>
               <w:t xml:space="preserve">Modify list numbering definitions</w:t>
@@ -8643,8 +8700,8 @@
             <w:pPr>
               <w:pStyle w:val="Compact"/>
               <w:jc w:val="left"/>
-              <w:ind w:right="0" w:firstLine="0" w:left="0"/>
-              <w:spacing w:lineRule="auto" w:after="40" w:line="240" w:before="40"/>
+              <w:ind w:firstLine="0" w:left="0" w:right="0"/>
+              <w:spacing w:after="40" w:before="40" w:lineRule="auto" w:line="240"/>
             </w:pPr>
             <w:r>
               <w:rPr>
@@ -8660,8 +8717,8 @@
             <w:pPr>
               <w:pStyle w:val="Compact"/>
               <w:jc w:val="left"/>
-              <w:ind w:right="0" w:firstLine="0" w:left="0"/>
-              <w:spacing w:lineRule="auto" w:after="40" w:line="240" w:before="40"/>
+              <w:ind w:firstLine="0" w:left="0" w:right="0"/>
+              <w:spacing w:after="40" w:before="40" w:lineRule="auto" w:line="240"/>
             </w:pPr>
             <w:r>
               <w:rPr>
@@ -8683,8 +8740,8 @@
             <w:pPr>
               <w:pStyle w:val="Compact"/>
               <w:jc w:val="left"/>
-              <w:ind w:right="0" w:firstLine="0" w:left="0"/>
-              <w:spacing w:lineRule="auto" w:after="40" w:line="240" w:before="40"/>
+              <w:ind w:firstLine="0" w:left="0" w:right="0"/>
+              <w:spacing w:after="40" w:before="40" w:lineRule="auto" w:line="240"/>
             </w:pPr>
             <w:r>
               <w:t xml:space="preserve">Add content type declarations</w:t>
@@ -8699,8 +8756,8 @@
             <w:pPr>
               <w:pStyle w:val="Compact"/>
               <w:jc w:val="left"/>
-              <w:ind w:right="0" w:firstLine="0" w:left="0"/>
-              <w:spacing w:lineRule="auto" w:after="40" w:line="240" w:before="40"/>
+              <w:ind w:firstLine="0" w:left="0" w:right="0"/>
+              <w:spacing w:after="40" w:before="40" w:lineRule="auto" w:line="240"/>
             </w:pPr>
             <w:r>
               <w:rPr>
@@ -8716,8 +8773,8 @@
             <w:pPr>
               <w:pStyle w:val="Compact"/>
               <w:jc w:val="left"/>
-              <w:ind w:right="0" w:firstLine="0" w:left="0"/>
-              <w:spacing w:lineRule="auto" w:after="40" w:line="240" w:before="40"/>
+              <w:ind w:firstLine="0" w:left="0" w:right="0"/>
+              <w:spacing w:after="40" w:before="40" w:lineRule="auto" w:line="240"/>
             </w:pPr>
             <w:r>
               <w:rPr>
@@ -8739,8 +8796,8 @@
             <w:pPr>
               <w:pStyle w:val="Compact"/>
               <w:jc w:val="left"/>
-              <w:ind w:right="0" w:firstLine="0" w:left="0"/>
-              <w:spacing w:lineRule="auto" w:after="40" w:line="240" w:before="40"/>
+              <w:ind w:firstLine="0" w:left="0" w:right="0"/>
+              <w:spacing w:after="40" w:before="40" w:lineRule="auto" w:line="240"/>
             </w:pPr>
             <w:r>
               <w:t xml:space="preserve">Modify document settings</w:t>
@@ -8755,8 +8812,8 @@
             <w:pPr>
               <w:pStyle w:val="Compact"/>
               <w:jc w:val="left"/>
-              <w:ind w:right="0" w:firstLine="0" w:left="0"/>
-              <w:spacing w:lineRule="auto" w:after="40" w:line="240" w:before="40"/>
+              <w:ind w:firstLine="0" w:left="0" w:right="0"/>
+              <w:spacing w:after="40" w:before="40" w:lineRule="auto" w:line="240"/>
             </w:pPr>
             <w:r>
               <w:rPr>
@@ -8772,8 +8829,8 @@
             <w:pPr>
               <w:pStyle w:val="Compact"/>
               <w:jc w:val="left"/>
-              <w:ind w:right="0" w:firstLine="0" w:left="0"/>
-              <w:spacing w:lineRule="auto" w:after="40" w:line="240" w:before="40"/>
+              <w:ind w:firstLine="0" w:left="0" w:right="0"/>
+              <w:spacing w:after="40" w:before="40" w:lineRule="auto" w:line="240"/>
             </w:pPr>
             <w:r>
               <w:rPr>
@@ -8795,8 +8852,8 @@
             <w:pPr>
               <w:pStyle w:val="Compact"/>
               <w:jc w:val="left"/>
-              <w:ind w:right="0" w:firstLine="0" w:left="0"/>
-              <w:spacing w:lineRule="auto" w:after="40" w:line="240" w:before="40"/>
+              <w:ind w:firstLine="0" w:left="0" w:right="0"/>
+              <w:spacing w:after="40" w:before="40" w:lineRule="auto" w:line="240"/>
             </w:pPr>
             <w:r>
               <w:t xml:space="preserve">Add/modify relationship entries</w:t>
@@ -8811,8 +8868,8 @@
             <w:pPr>
               <w:pStyle w:val="Compact"/>
               <w:jc w:val="left"/>
-              <w:ind w:right="0" w:firstLine="0" w:left="0"/>
-              <w:spacing w:lineRule="auto" w:after="40" w:line="240" w:before="40"/>
+              <w:ind w:firstLine="0" w:left="0" w:right="0"/>
+              <w:spacing w:after="40" w:before="40" w:lineRule="auto" w:line="240"/>
             </w:pPr>
             <w:r>
               <w:rPr>
@@ -8828,8 +8885,8 @@
             <w:pPr>
               <w:pStyle w:val="Compact"/>
               <w:jc w:val="left"/>
-              <w:ind w:right="0" w:firstLine="0" w:left="0"/>
-              <w:spacing w:lineRule="auto" w:after="40" w:line="240" w:before="40"/>
+              <w:ind w:firstLine="0" w:left="0" w:right="0"/>
+              <w:spacing w:after="40" w:before="40" w:lineRule="auto" w:line="240"/>
             </w:pPr>
             <w:r>
               <w:t xml:space="preserve">Temp directory path</w:t>
@@ -8842,8 +8899,8 @@
             <w:pPr>
               <w:pStyle w:val="Compact"/>
               <w:jc w:val="left"/>
-              <w:ind w:right="0" w:firstLine="0" w:left="0"/>
-              <w:spacing w:lineRule="auto" w:after="40" w:line="240" w:before="40"/>
+              <w:ind w:firstLine="0" w:left="0" w:right="0"/>
+              <w:spacing w:after="40" w:before="40" w:lineRule="auto" w:line="240"/>
             </w:pPr>
             <w:r>
               <w:t xml:space="preserve">Create new parts (headers, footers)</w:t>
@@ -8852,7 +8909,6 @@
         </w:tc>
       </w:tr>
     </w:tbl>
-    <w:bookmarkEnd w:id="25759"/>
     <w:p>
       <w:pPr>
         <w:pStyle w:val="BodyText"/>
@@ -8895,7 +8951,16 @@
         <w:t xml:space="preserve">:</w:t>
       </w:r>
     </w:p>
-    <w:bookmarkStart w:id="69874" w:name="listing-src-docx-custom-postprocessor"/>
+    <w:p>
+      <w:pPr>
+        <w:spacing w:line="20" w:before="0" w:lineRule="exact" w:after="0"/>
+        <w:rPr>
+          <w:sz w:val="2"/>
+        </w:rPr>
+      </w:pPr>
+      <w:bookmarkStart w:id="69874" w:name="listing-src-docx-custom-postprocessor"/>
+      <w:bookmarkEnd w:id="69874"/>
+    </w:p>
     <w:p>
       <w:pPr>
         <w:pStyle w:val="Caption"/>
@@ -9492,7 +9557,6 @@
         <w:t xml:space="preserve">M</w:t>
       </w:r>
     </w:p>
-    <w:bookmarkEnd w:id="69874"/>
     <w:bookmarkEnd w:id="33"/>
     <w:bookmarkStart w:id="34" w:name="the-config-parameter"/>
     <w:p>
@@ -9661,7 +9725,16 @@
         <w:t xml:space="preserve">) handles:</w:t>
       </w:r>
     </w:p>
-    <w:bookmarkStart w:id="27004" w:name="csv-tbl-docx-filter-features"/>
+    <w:p>
+      <w:pPr>
+        <w:spacing w:line="20" w:before="0" w:lineRule="exact" w:after="0"/>
+        <w:rPr>
+          <w:sz w:val="2"/>
+        </w:rPr>
+      </w:pPr>
+      <w:bookmarkStart w:id="27004" w:name="csv-tbl-docx-filter-features"/>
+      <w:bookmarkEnd w:id="27004"/>
+    </w:p>
     <w:p>
       <w:pPr>
         <w:pStyle w:val="Caption"/>
@@ -9695,18 +9768,18 @@
         <w:tblW w:type="auto" w:w="0"/>
         <w:tblLook w:firstRow="1" w:lastRow="0" w:firstColumn="0" w:lastColumn="0" w:noHBand="0" w:noVBand="0" w:val="0020"/>
         <w:tblBorders>
-          <w:top w:color="000000" w:sz="6" w:space="0" w:val="single"/>
-          <w:left w:color="000000" w:sz="6" w:space="0" w:val="single"/>
-          <w:bottom w:color="000000" w:sz="6" w:space="0" w:val="single"/>
-          <w:right w:color="000000" w:sz="6" w:space="0" w:val="single"/>
-          <w:insideH w:color="000000" w:sz="6" w:space="0" w:val="single"/>
-          <w:insideV w:color="000000" w:sz="6" w:space="0" w:val="single"/>
+          <w:top w:val="single" w:space="0" w:color="000000" w:sz="6"/>
+          <w:left w:val="single" w:space="0" w:color="000000" w:sz="6"/>
+          <w:bottom w:val="single" w:space="0" w:color="000000" w:sz="6"/>
+          <w:right w:val="single" w:space="0" w:color="000000" w:sz="6"/>
+          <w:insideH w:val="single" w:space="0" w:color="000000" w:sz="6"/>
+          <w:insideV w:val="single" w:space="0" w:color="000000" w:sz="6"/>
         </w:tblBorders>
         <w:tblCellMar>
-          <w:top w:w="57" w:type="dxa"/>
-          <w:left w:w="108" w:type="dxa"/>
-          <w:bottom w:w="57" w:type="dxa"/>
-          <w:right w:w="108" w:type="dxa"/>
+          <w:top w:type="dxa" w:w="57"/>
+          <w:left w:type="dxa" w:w="108"/>
+          <w:bottom w:type="dxa" w:w="57"/>
+          <w:right w:type="dxa" w:w="108"/>
         </w:tblCellMar>
       </w:tblPr>
       <w:tblGrid>
@@ -9719,14 +9792,14 @@
         </w:trPr>
         <w:tc>
           <w:tcPr>
-            <w:shd w:color="auto" w:fill="E8E8E8" w:val="clear"/>
+            <w:shd w:val="clear" w:color="auto" w:fill="E8E8E8"/>
           </w:tcPr>
           <w:p>
             <w:pPr>
               <w:pStyle w:val="Compact"/>
               <w:jc w:val="left"/>
-              <w:ind w:right="0" w:firstLine="0" w:left="0"/>
-              <w:spacing w:lineRule="auto" w:after="40" w:line="240" w:before="40"/>
+              <w:ind w:firstLine="0" w:left="0" w:right="0"/>
+              <w:spacing w:after="40" w:before="40" w:lineRule="auto" w:line="240"/>
             </w:pPr>
             <w:r>
               <w:rPr>
@@ -9738,14 +9811,14 @@
         </w:tc>
         <w:tc>
           <w:tcPr>
-            <w:shd w:color="auto" w:fill="E8E8E8" w:val="clear"/>
+            <w:shd w:val="clear" w:color="auto" w:fill="E8E8E8"/>
           </w:tcPr>
           <w:p>
             <w:pPr>
               <w:pStyle w:val="Compact"/>
               <w:jc w:val="left"/>
-              <w:ind w:right="0" w:firstLine="0" w:left="0"/>
-              <w:spacing w:lineRule="auto" w:after="40" w:line="240" w:before="40"/>
+              <w:ind w:firstLine="0" w:left="0" w:right="0"/>
+              <w:spacing w:after="40" w:before="40" w:lineRule="auto" w:line="240"/>
             </w:pPr>
             <w:r>
               <w:rPr>
@@ -9763,8 +9836,8 @@
             <w:pPr>
               <w:pStyle w:val="Compact"/>
               <w:jc w:val="left"/>
-              <w:ind w:right="0" w:firstLine="0" w:left="0"/>
-              <w:spacing w:lineRule="auto" w:after="40" w:line="240" w:before="40"/>
+              <w:ind w:firstLine="0" w:left="0" w:right="0"/>
+              <w:spacing w:after="40" w:before="40" w:lineRule="auto" w:line="240"/>
             </w:pPr>
             <w:r>
               <w:rPr>
@@ -9780,8 +9853,8 @@
             <w:pPr>
               <w:pStyle w:val="Compact"/>
               <w:jc w:val="left"/>
-              <w:ind w:right="0" w:firstLine="0" w:left="0"/>
-              <w:spacing w:lineRule="auto" w:after="40" w:line="240" w:before="40"/>
+              <w:ind w:firstLine="0" w:left="0" w:right="0"/>
+              <w:spacing w:after="40" w:before="40" w:lineRule="auto" w:line="240"/>
             </w:pPr>
             <w:r>
               <w:t xml:space="preserve">OOXML page break</w:t>
@@ -9796,8 +9869,8 @@
             <w:pPr>
               <w:pStyle w:val="Compact"/>
               <w:jc w:val="left"/>
-              <w:ind w:right="0" w:firstLine="0" w:left="0"/>
-              <w:spacing w:lineRule="auto" w:after="40" w:line="240" w:before="40"/>
+              <w:ind w:firstLine="0" w:left="0" w:right="0"/>
+              <w:spacing w:after="40" w:before="40" w:lineRule="auto" w:line="240"/>
             </w:pPr>
             <w:r>
               <w:rPr>
@@ -9813,8 +9886,8 @@
             <w:pPr>
               <w:pStyle w:val="Compact"/>
               <w:jc w:val="left"/>
-              <w:ind w:right="0" w:firstLine="0" w:left="0"/>
-              <w:spacing w:lineRule="auto" w:after="40" w:line="240" w:before="40"/>
+              <w:ind w:firstLine="0" w:left="0" w:right="0"/>
+              <w:spacing w:after="40" w:before="40" w:lineRule="auto" w:line="240"/>
             </w:pPr>
             <w:r>
               <w:t xml:space="preserve">OOXML spacing (in twips)</w:t>
@@ -9829,8 +9902,8 @@
             <w:pPr>
               <w:pStyle w:val="Compact"/>
               <w:jc w:val="left"/>
-              <w:ind w:right="0" w:firstLine="0" w:left="0"/>
-              <w:spacing w:lineRule="auto" w:after="40" w:line="240" w:before="40"/>
+              <w:ind w:firstLine="0" w:left="0" w:right="0"/>
+              <w:spacing w:after="40" w:before="40" w:lineRule="auto" w:line="240"/>
             </w:pPr>
             <w:r>
               <w:rPr>
@@ -9846,8 +9919,8 @@
             <w:pPr>
               <w:pStyle w:val="Compact"/>
               <w:jc w:val="left"/>
-              <w:ind w:right="0" w:firstLine="0" w:left="0"/>
-              <w:spacing w:lineRule="auto" w:after="40" w:line="240" w:before="40"/>
+              <w:ind w:firstLine="0" w:left="0" w:right="0"/>
+              <w:spacing w:after="40" w:before="40" w:lineRule="auto" w:line="240"/>
             </w:pPr>
             <w:r>
               <w:t xml:space="preserve">OOXML bookmark start</w:t>
@@ -9862,8 +9935,8 @@
             <w:pPr>
               <w:pStyle w:val="Compact"/>
               <w:jc w:val="left"/>
-              <w:ind w:right="0" w:firstLine="0" w:left="0"/>
-              <w:spacing w:lineRule="auto" w:after="40" w:line="240" w:before="40"/>
+              <w:ind w:firstLine="0" w:left="0" w:right="0"/>
+              <w:spacing w:after="40" w:before="40" w:lineRule="auto" w:line="240"/>
             </w:pPr>
             <w:r>
               <w:rPr>
@@ -9879,8 +9952,8 @@
             <w:pPr>
               <w:pStyle w:val="Compact"/>
               <w:jc w:val="left"/>
-              <w:ind w:right="0" w:firstLine="0" w:left="0"/>
-              <w:spacing w:lineRule="auto" w:after="40" w:line="240" w:before="40"/>
+              <w:ind w:firstLine="0" w:left="0" w:right="0"/>
+              <w:spacing w:after="40" w:before="40" w:lineRule="auto" w:line="240"/>
             </w:pPr>
             <w:r>
               <w:t xml:space="preserve">OOXML math element</w:t>
@@ -9895,8 +9968,8 @@
             <w:pPr>
               <w:pStyle w:val="Compact"/>
               <w:jc w:val="left"/>
-              <w:ind w:right="0" w:firstLine="0" w:left="0"/>
-              <w:spacing w:lineRule="auto" w:after="40" w:line="240" w:before="40"/>
+              <w:ind w:firstLine="0" w:left="0" w:right="0"/>
+              <w:spacing w:after="40" w:before="40" w:lineRule="auto" w:line="240"/>
             </w:pPr>
             <w:r>
               <w:rPr>
@@ -9912,8 +9985,8 @@
             <w:pPr>
               <w:pStyle w:val="Compact"/>
               <w:jc w:val="left"/>
-              <w:ind w:right="0" w:firstLine="0" w:left="0"/>
-              <w:spacing w:lineRule="auto" w:after="40" w:line="240" w:before="40"/>
+              <w:ind w:firstLine="0" w:left="0" w:right="0"/>
+              <w:spacing w:after="40" w:before="40" w:lineRule="auto" w:line="240"/>
             </w:pPr>
             <w:r>
               <w:t xml:space="preserve">OOXML caption with SEQ field</w:t>
@@ -9928,8 +10001,8 @@
             <w:pPr>
               <w:pStyle w:val="Compact"/>
               <w:jc w:val="left"/>
-              <w:ind w:right="0" w:firstLine="0" w:left="0"/>
-              <w:spacing w:lineRule="auto" w:after="40" w:line="240" w:before="40"/>
+              <w:ind w:firstLine="0" w:left="0" w:right="0"/>
+              <w:spacing w:after="40" w:before="40" w:lineRule="auto" w:line="240"/>
             </w:pPr>
             <w:r>
               <w:rPr>
@@ -9945,8 +10018,8 @@
             <w:pPr>
               <w:pStyle w:val="Compact"/>
               <w:jc w:val="left"/>
-              <w:ind w:right="0" w:firstLine="0" w:left="0"/>
-              <w:spacing w:lineRule="auto" w:after="40" w:line="240" w:before="40"/>
+              <w:ind w:firstLine="0" w:left="0" w:right="0"/>
+              <w:spacing w:after="40" w:before="40" w:lineRule="auto" w:line="240"/>
             </w:pPr>
             <w:r>
               <w:t xml:space="preserve">OOXML numbered equation with tab layout</w:t>
@@ -9961,8 +10034,8 @@
             <w:pPr>
               <w:pStyle w:val="Compact"/>
               <w:jc w:val="left"/>
-              <w:ind w:right="0" w:firstLine="0" w:left="0"/>
-              <w:spacing w:lineRule="auto" w:after="40" w:line="240" w:before="40"/>
+              <w:ind w:firstLine="0" w:left="0" w:right="0"/>
+              <w:spacing w:after="40" w:before="40" w:lineRule="auto" w:line="240"/>
             </w:pPr>
             <w:r>
               <w:rPr>
@@ -9978,8 +10051,8 @@
             <w:pPr>
               <w:pStyle w:val="Compact"/>
               <w:jc w:val="left"/>
-              <w:ind w:right="0" w:firstLine="0" w:left="0"/>
-              <w:spacing w:lineRule="auto" w:after="40" w:line="240" w:before="40"/>
+              <w:ind w:firstLine="0" w:left="0" w:right="0"/>
+              <w:spacing w:after="40" w:before="40" w:lineRule="auto" w:line="240"/>
             </w:pPr>
             <w:r>
               <w:t xml:space="preserve">Position markers for postprocessor</w:t>
@@ -9994,8 +10067,8 @@
             <w:pPr>
               <w:pStyle w:val="Compact"/>
               <w:jc w:val="left"/>
-              <w:ind w:right="0" w:firstLine="0" w:left="0"/>
-              <w:spacing w:lineRule="auto" w:after="40" w:line="240" w:before="40"/>
+              <w:ind w:firstLine="0" w:left="0" w:right="0"/>
+              <w:spacing w:after="40" w:before="40" w:lineRule="auto" w:line="240"/>
             </w:pPr>
             <w:r>
               <w:rPr>
@@ -10032,8 +10105,8 @@
             <w:pPr>
               <w:pStyle w:val="Compact"/>
               <w:jc w:val="left"/>
-              <w:ind w:right="0" w:firstLine="0" w:left="0"/>
-              <w:spacing w:lineRule="auto" w:after="40" w:line="240" w:before="40"/>
+              <w:ind w:firstLine="0" w:left="0" w:right="0"/>
+              <w:spacing w:after="40" w:before="40" w:lineRule="auto" w:line="240"/>
             </w:pPr>
             <w:r>
               <w:t xml:space="preserve">Rewritten to</w:t>
@@ -10057,7 +10130,6 @@
         </w:tc>
       </w:tr>
     </w:tbl>
-    <w:bookmarkEnd w:id="27004"/>
     <w:bookmarkStart w:id="36" w:name="when-to-use-filters-vs-postprocessors"/>
     <w:p>
       <w:pPr>
@@ -10143,7 +10215,16 @@
         <w:t xml:space="preserve">DOCX-Specific Settings</w:t>
       </w:r>
     </w:p>
-    <w:bookmarkStart w:id="27890" w:name="listing-src-docx-project-config"/>
+    <w:p>
+      <w:pPr>
+        <w:spacing w:line="20" w:before="0" w:lineRule="exact" w:after="0"/>
+        <w:rPr>
+          <w:sz w:val="2"/>
+        </w:rPr>
+      </w:pPr>
+      <w:bookmarkStart w:id="27890" w:name="listing-src-docx-project-config"/>
+      <w:bookmarkEnd w:id="27890"/>
+    </w:p>
     <w:p>
       <w:pPr>
         <w:pStyle w:val="Caption"/>
@@ -10332,7 +10413,6 @@
         <w:t xml:space="preserve">  # reference_doc: assets/reference.docx  # Custom reference (overrides preset)</w:t>
       </w:r>
     </w:p>
-    <w:bookmarkEnd w:id="27890"/>
     <w:bookmarkEnd w:id="38"/>
     <w:bookmarkStart w:id="39" w:name="configuration-precedence"/>
     <w:p>
@@ -10587,7 +10667,16 @@
         <w:t xml:space="preserve">To force regeneration of the reference document, delete it:</w:t>
       </w:r>
     </w:p>
-    <w:bookmarkStart w:id="76751" w:name="listing-src-docx-force-reference"/>
+    <w:p>
+      <w:pPr>
+        <w:spacing w:line="20" w:before="0" w:lineRule="exact" w:after="0"/>
+        <w:rPr>
+          <w:sz w:val="2"/>
+        </w:rPr>
+      </w:pPr>
+      <w:bookmarkStart w:id="76751" w:name="listing-src-docx-force-reference"/>
+      <w:bookmarkEnd w:id="76751"/>
+    </w:p>
     <w:p>
       <w:pPr>
         <w:pStyle w:val="Caption"/>
@@ -10653,7 +10742,6 @@
         <w:t xml:space="preserve">./bin/speccompiler-core</w:t>
       </w:r>
     </w:p>
-    <w:bookmarkEnd w:id="76751"/>
     <w:bookmarkEnd w:id="41"/>
     <w:sectPr>
       <w:footerReference r:id="rId9200" w:type="default"/>
@@ -10673,17 +10761,17 @@
 </file>
 
 <file path=word/footer1.xml><?xml version="1.0" encoding="utf-8"?>
-<w:ftr xmlns:w="http://schemas.openxmlformats.org/wordprocessingml/2006/main" xmlns:r="http://schemas.openxmlformats.org/officeDocument/2006/relationships">
+<w:ftr xmlns:r="http://schemas.openxmlformats.org/officeDocument/2006/relationships" xmlns:w="http://schemas.openxmlformats.org/wordprocessingml/2006/main">
   <w:tbl>
     <w:tblPr>
-      <w:tblW w:w="5000" w:type="pct"/>
+      <w:tblW w:type="pct" w:w="5000"/>
       <w:tblBorders>
-        <w:top w:color="CCCCCC" w:sz="4" w:space="1" w:val="single"/>
-        <w:bottom w:color="auto" w:sz="0" w:space="0" w:val="none"/>
-        <w:left w:color="auto" w:sz="0" w:space="0" w:val="none"/>
-        <w:right w:color="auto" w:sz="0" w:space="0" w:val="none"/>
-        <w:insideH w:color="auto" w:sz="0" w:space="0" w:val="none"/>
-        <w:insideV w:color="auto" w:sz="0" w:space="0" w:val="none"/>
+        <w:top w:val="single" w:space="1" w:color="CCCCCC" w:sz="4"/>
+        <w:bottom w:val="none" w:space="0" w:color="auto" w:sz="0"/>
+        <w:left w:val="none" w:space="0" w:color="auto" w:sz="0"/>
+        <w:right w:val="none" w:space="0" w:color="auto" w:sz="0"/>
+        <w:insideH w:val="none" w:space="0" w:color="auto" w:sz="0"/>
+        <w:insideV w:val="none" w:space="0" w:color="auto" w:sz="0"/>
       </w:tblBorders>
       <w:tblLayout w:type="fixed"/>
     </w:tblPr>
@@ -10695,7 +10783,7 @@
     <w:tr>
       <w:tc>
         <w:tcPr>
-          <w:tcW w:w="1667" w:type="pct"/>
+          <w:tcW w:type="pct" w:w="1667"/>
         </w:tcPr>
         <w:p>
           <w:pPr>
@@ -10709,7 +10797,7 @@
       </w:tc>
       <w:tc>
         <w:tcPr>
-          <w:tcW w:w="1667" w:type="pct"/>
+          <w:tcW w:type="pct" w:w="1667"/>
         </w:tcPr>
         <w:p>
           <w:pPr>
@@ -10723,7 +10811,7 @@
       </w:tc>
       <w:tc>
         <w:tcPr>
-          <w:tcW w:w="1667" w:type="pct"/>
+          <w:tcW w:type="pct" w:w="1667"/>
         </w:tcPr>
         <w:p>
           <w:pPr>
@@ -10799,7 +10887,7 @@
 </file>
 
 <file path=word/header1.xml><?xml version="1.0" encoding="utf-8"?>
-<w:hdr xmlns:w="http://schemas.openxmlformats.org/wordprocessingml/2006/main" xmlns:r="http://schemas.openxmlformats.org/officeDocument/2006/relationships">
+<w:hdr xmlns:r="http://schemas.openxmlformats.org/officeDocument/2006/relationships" xmlns:w="http://schemas.openxmlformats.org/wordprocessingml/2006/main">
   <w:p>
     <w:pPr>
       <w:pStyle w:val="Header"/>
@@ -10809,7 +10897,7 @@
 </file>
 
 <file path=word/header2.xml><?xml version="1.0" encoding="utf-8"?>
-<w:hdr xmlns:w="http://schemas.openxmlformats.org/wordprocessingml/2006/main" xmlns:r="http://schemas.openxmlformats.org/officeDocument/2006/relationships">
+<w:hdr xmlns:r="http://schemas.openxmlformats.org/officeDocument/2006/relationships" xmlns:w="http://schemas.openxmlformats.org/wordprocessingml/2006/main">
   <w:p>
     <w:pPr>
       <w:pStyle w:val="Header"/>
@@ -10852,7 +10940,7 @@
       <w:lvlText w:val="%1"/>
       <w:lvlJc w:val="left"/>
       <w:pPr>
-        <w:ind w:left="0" w:hanging="0"/>
+        <w:ind w:hanging="0" w:left="0"/>
       </w:pPr>
     </w:lvl>
     <w:lvl w:ilvl="1">
@@ -10864,7 +10952,7 @@
       <w:lvlText w:val="%1.%2"/>
       <w:lvlJc w:val="left"/>
       <w:pPr>
-        <w:ind w:left="0" w:hanging="0"/>
+        <w:ind w:hanging="0" w:left="0"/>
       </w:pPr>
     </w:lvl>
     <w:lvl w:ilvl="2">
@@ -10876,7 +10964,7 @@
       <w:lvlText w:val="%1.%2.%3"/>
       <w:lvlJc w:val="left"/>
       <w:pPr>
-        <w:ind w:left="0" w:hanging="0"/>
+        <w:ind w:hanging="0" w:left="0"/>
       </w:pPr>
     </w:lvl>
     <w:lvl w:ilvl="3">
@@ -10888,7 +10976,7 @@
       <w:lvlText w:val="%1.%2.%3.%4"/>
       <w:lvlJc w:val="left"/>
       <w:pPr>
-        <w:ind w:left="0" w:hanging="0"/>
+        <w:ind w:hanging="0" w:left="0"/>
       </w:pPr>
     </w:lvl>
     <w:lvl w:ilvl="4">
@@ -10900,7 +10988,7 @@
       <w:lvlText w:val="%1.%2.%3.%4.%5"/>
       <w:lvlJc w:val="left"/>
       <w:pPr>
-        <w:ind w:left="0" w:hanging="0"/>
+        <w:ind w:hanging="0" w:left="0"/>
       </w:pPr>
     </w:lvl>
   </w:abstractNum>
@@ -12203,32 +12291,224 @@
     <w:basedOn w:val="VerbatimChar"/>
     <w:rPr/>
   </w:style>
-  <w:style w:styleId="VerbatimChar" w:type="character" w:customStyle="1">
+  <w:style w:styleId="VerbatimChar" w:customStyle="1" w:type="character">
     <w:name w:val="Verbatim Char"/>
     <w:rPr>
-      <w:rFonts w:hAnsi="Courier New" w:cs="Courier New" w:ascii="Courier New"/>
+      <w:rFonts w:ascii="Courier New" w:hAnsi="Courier New" w:cs="Courier New"/>
       <w:sz w:val="20"/>
       <w:szCs w:val="20"/>
     </w:rPr>
   </w:style>
-  <w:style w:styleId="SourceCode" w:type="paragraph" w:customStyle="1">
+  <w:style w:styleId="SourceCode" w:customStyle="1" w:type="paragraph">
     <w:name w:val="Source Code"/>
     <w:basedOn w:val="Normal"/>
     <w:pPr>
-      <w:spacing w:lineRule="auto" w:after="0" w:line="240" w:before="0"/>
+      <w:spacing w:after="0" w:before="0" w:lineRule="auto" w:line="240"/>
       <w:jc w:val="left"/>
       <w:pBdr>
-        <w:top w:color="CCCCCC" w:sz="4" w:space="1" w:val="single"/>
-        <w:bottom w:color="CCCCCC" w:sz="4" w:space="1" w:val="single"/>
-        <w:left w:color="CCCCCC" w:sz="4" w:space="1" w:val="single"/>
-        <w:right w:color="CCCCCC" w:sz="4" w:space="1" w:val="single"/>
+        <w:top w:val="single" w:space="1" w:color="CCCCCC" w:sz="4"/>
+        <w:bottom w:val="single" w:space="1" w:color="CCCCCC" w:sz="4"/>
+        <w:left w:val="single" w:space="1" w:color="CCCCCC" w:sz="4"/>
+        <w:right w:val="single" w:space="1" w:color="CCCCCC" w:sz="4"/>
       </w:pBdr>
-      <w:shd w:color="auto" w:fill="F5F5F5" w:val="clear"/>
+      <w:shd w:val="clear" w:color="auto" w:fill="F5F5F5"/>
     </w:pPr>
     <w:rPr>
-      <w:rFonts w:hAnsi="Courier New" w:cs="Courier New" w:ascii="Courier New"/>
+      <w:rFonts w:ascii="Courier New" w:hAnsi="Courier New" w:cs="Courier New"/>
       <w:sz w:val="20"/>
       <w:szCs w:val="20"/>
+    </w:rPr>
+  </w:style>
+  <w:style w:styleId="CoverTitle" w:customStyle="1" w:type="paragraph">
+    <w:name w:val="Cover Title"/>
+    <w:basedOn w:val="Normal"/>
+    <w:qFormat/>
+    <w:uiPriority w:val="99"/>
+    <w:pPr>
+      <w:widowControl/>
+      <w:spacing w:after="240" w:before="0" w:lineRule="auto" w:line="240"/>
+      <w:ind w:firstLine="0"/>
+      <w:jc w:val="center"/>
+    </w:pPr>
+    <w:rPr>
+      <w:rFonts w:ascii="Calibri" w:hAnsi="Calibri" w:eastAsia="Calibri" w:cs="Calibri"/>
+      <w:b/>
+      <w:bCs/>
+      <w:sz w:val="56"/>
+      <w:szCs w:val="56"/>
+      <w:color w:val="000000"/>
+    </w:rPr>
+  </w:style>
+  <w:style w:styleId="FigureCenter" w:customStyle="1" w:type="paragraph">
+    <w:name w:val="Figure Center"/>
+    <w:basedOn w:val="Normal"/>
+    <w:qFormat/>
+    <w:uiPriority w:val="99"/>
+    <w:pPr>
+      <w:widowControl/>
+      <w:spacing w:after="120" w:before="120" w:lineRule="auto" w:line="240"/>
+      <w:ind w:firstLine="0"/>
+      <w:jc w:val="center"/>
+    </w:pPr>
+  </w:style>
+  <w:style w:styleId="TOC2" w:type="paragraph">
+    <w:name w:val="TOC 2"/>
+    <w:basedOn w:val="Normal"/>
+    <w:qFormat/>
+    <w:uiPriority w:val="99"/>
+    <w:pPr>
+      <w:widowControl/>
+      <w:spacing w:after="0" w:before="0" w:lineRule="auto" w:line="276"/>
+      <w:ind w:firstLine="0" w:left="360"/>
+    </w:pPr>
+    <w:rPr>
+      <w:rFonts w:ascii="Calibri" w:hAnsi="Calibri" w:eastAsia="Calibri" w:cs="Calibri"/>
+      <w:sz w:val="24"/>
+      <w:szCs w:val="24"/>
+      <w:color w:val="000000"/>
+    </w:rPr>
+  </w:style>
+  <w:style w:styleId="Quote" w:type="paragraph">
+    <w:name w:val="Quote"/>
+    <w:basedOn w:val="Normal"/>
+    <w:qFormat/>
+    <w:uiPriority w:val="99"/>
+    <w:pPr>
+      <w:widowControl/>
+      <w:spacing w:after="160" w:before="200" w:lineRule="auto" w:line="276"/>
+      <w:ind w:firstLine="0" w:left="720" w:right="720"/>
+    </w:pPr>
+    <w:rPr>
+      <w:rFonts w:ascii="Calibri" w:hAnsi="Calibri" w:eastAsia="Calibri" w:cs="Calibri"/>
+      <w:i/>
+      <w:iCs/>
+      <w:sz w:val="24"/>
+      <w:szCs w:val="24"/>
+      <w:color w:val="404040"/>
+    </w:rPr>
+  </w:style>
+  <w:style w:styleId="Reference" w:customStyle="1" w:type="paragraph">
+    <w:name w:val="Reference"/>
+    <w:basedOn w:val="Normal"/>
+    <w:qFormat/>
+    <w:uiPriority w:val="99"/>
+    <w:pPr>
+      <w:widowControl/>
+      <w:spacing w:after="120" w:before="0" w:lineRule="auto" w:line="276"/>
+      <w:ind w:hanging="720" w:left="720"/>
+    </w:pPr>
+    <w:rPr>
+      <w:rFonts w:ascii="Calibri" w:hAnsi="Calibri" w:eastAsia="Calibri" w:cs="Calibri"/>
+      <w:sz w:val="24"/>
+      <w:szCs w:val="24"/>
+    </w:rPr>
+  </w:style>
+  <w:style w:styleId="CoverDocId" w:customStyle="1" w:type="paragraph">
+    <w:name w:val="Cover Document ID"/>
+    <w:basedOn w:val="Normal"/>
+    <w:qFormat/>
+    <w:uiPriority w:val="99"/>
+    <w:pPr>
+      <w:widowControl/>
+      <w:spacing w:after="80" w:before="0" w:lineRule="auto" w:line="240"/>
+      <w:ind w:firstLine="0"/>
+      <w:jc w:val="center"/>
+    </w:pPr>
+    <w:rPr>
+      <w:rFonts w:ascii="Calibri" w:hAnsi="Calibri" w:eastAsia="Calibri" w:cs="Calibri"/>
+      <w:sz w:val="20"/>
+      <w:szCs w:val="20"/>
+      <w:color w:val="888888"/>
+    </w:rPr>
+  </w:style>
+  <w:style w:styleId="CoverAuthor" w:customStyle="1" w:type="paragraph">
+    <w:name w:val="Cover Author"/>
+    <w:basedOn w:val="Normal"/>
+    <w:qFormat/>
+    <w:uiPriority w:val="99"/>
+    <w:pPr>
+      <w:widowControl/>
+      <w:spacing w:after="80" w:before="0" w:lineRule="auto" w:line="240"/>
+      <w:ind w:firstLine="0"/>
+      <w:jc w:val="center"/>
+    </w:pPr>
+    <w:rPr>
+      <w:rFonts w:ascii="Calibri" w:hAnsi="Calibri" w:eastAsia="Calibri" w:cs="Calibri"/>
+      <w:sz w:val="24"/>
+      <w:szCs w:val="24"/>
+      <w:color w:val="000000"/>
+    </w:rPr>
+  </w:style>
+  <w:style w:styleId="CoverDate" w:customStyle="1" w:type="paragraph">
+    <w:name w:val="Cover Date"/>
+    <w:basedOn w:val="Normal"/>
+    <w:qFormat/>
+    <w:uiPriority w:val="99"/>
+    <w:pPr>
+      <w:widowControl/>
+      <w:spacing w:after="80" w:before="0" w:lineRule="auto" w:line="240"/>
+      <w:ind w:firstLine="0"/>
+      <w:jc w:val="center"/>
+    </w:pPr>
+    <w:rPr>
+      <w:rFonts w:ascii="Calibri" w:hAnsi="Calibri" w:eastAsia="Calibri" w:cs="Calibri"/>
+      <w:i/>
+      <w:iCs/>
+      <w:sz w:val="24"/>
+      <w:szCs w:val="24"/>
+      <w:color w:val="666666"/>
+    </w:rPr>
+  </w:style>
+  <w:style w:styleId="CoverSubtitle" w:customStyle="1" w:type="paragraph">
+    <w:name w:val="Cover Subtitle"/>
+    <w:basedOn w:val="Normal"/>
+    <w:qFormat/>
+    <w:uiPriority w:val="99"/>
+    <w:pPr>
+      <w:widowControl/>
+      <w:spacing w:after="160" w:before="0" w:lineRule="auto" w:line="240"/>
+      <w:ind w:firstLine="0"/>
+      <w:jc w:val="center"/>
+    </w:pPr>
+    <w:rPr>
+      <w:rFonts w:ascii="Calibri" w:hAnsi="Calibri" w:eastAsia="Calibri" w:cs="Calibri"/>
+      <w:sz w:val="32"/>
+      <w:szCs w:val="32"/>
+      <w:color w:val="444444"/>
+    </w:rPr>
+  </w:style>
+  <w:style w:styleId="CoverVersion" w:customStyle="1" w:type="paragraph">
+    <w:name w:val="Cover Version"/>
+    <w:basedOn w:val="Normal"/>
+    <w:qFormat/>
+    <w:uiPriority w:val="99"/>
+    <w:pPr>
+      <w:widowControl/>
+      <w:spacing w:after="80" w:before="0" w:lineRule="auto" w:line="240"/>
+      <w:ind w:firstLine="0"/>
+      <w:jc w:val="center"/>
+    </w:pPr>
+    <w:rPr>
+      <w:rFonts w:ascii="Calibri" w:hAnsi="Calibri" w:eastAsia="Calibri" w:cs="Calibri"/>
+      <w:sz w:val="20"/>
+      <w:szCs w:val="20"/>
+      <w:color w:val="888888"/>
+    </w:rPr>
+  </w:style>
+  <w:style w:styleId="Source" w:customStyle="1" w:type="paragraph">
+    <w:name w:val="Source"/>
+    <w:basedOn w:val="Normal"/>
+    <w:qFormat/>
+    <w:uiPriority w:val="99"/>
+    <w:pPr>
+      <w:widowControl/>
+      <w:spacing w:after="80" w:before="0" w:lineRule="auto" w:line="240"/>
+      <w:ind w:firstLine="0"/>
+    </w:pPr>
+    <w:rPr>
+      <w:rFonts w:ascii="Calibri" w:hAnsi="Calibri" w:eastAsia="Calibri" w:cs="Calibri"/>
+      <w:sz w:val="18"/>
+      <w:szCs w:val="18"/>
     </w:rPr>
   </w:style>
   <w:style w:styleId="TOC1" w:type="paragraph">
@@ -12238,11 +12518,11 @@
     <w:uiPriority w:val="99"/>
     <w:pPr>
       <w:widowControl/>
-      <w:spacing w:lineRule="auto" w:after="0" w:line="276" w:before="120"/>
+      <w:spacing w:after="0" w:before="120" w:lineRule="auto" w:line="276"/>
       <w:ind w:firstLine="0"/>
     </w:pPr>
     <w:rPr>
-      <w:rFonts w:eastAsia="Calibri" w:hAnsi="Calibri" w:cs="Calibri" w:ascii="Calibri"/>
+      <w:rFonts w:ascii="Calibri" w:hAnsi="Calibri" w:eastAsia="Calibri" w:cs="Calibri"/>
       <w:b/>
       <w:bCs/>
       <w:sz w:val="24"/>
@@ -12250,168 +12530,7 @@
       <w:color w:val="000000"/>
     </w:rPr>
   </w:style>
-  <w:style w:styleId="CoverSubtitle" w:type="paragraph" w:customStyle="1">
-    <w:name w:val="Cover Subtitle"/>
-    <w:basedOn w:val="Normal"/>
-    <w:qFormat/>
-    <w:uiPriority w:val="99"/>
-    <w:pPr>
-      <w:widowControl/>
-      <w:spacing w:lineRule="auto" w:after="160" w:line="240" w:before="0"/>
-      <w:ind w:firstLine="0"/>
-      <w:jc w:val="center"/>
-    </w:pPr>
-    <w:rPr>
-      <w:rFonts w:eastAsia="Calibri" w:hAnsi="Calibri" w:cs="Calibri" w:ascii="Calibri"/>
-      <w:sz w:val="32"/>
-      <w:szCs w:val="32"/>
-      <w:color w:val="444444"/>
-    </w:rPr>
-  </w:style>
-  <w:style w:styleId="TOC3" w:type="paragraph">
-    <w:name w:val="TOC 3"/>
-    <w:basedOn w:val="Normal"/>
-    <w:qFormat/>
-    <w:uiPriority w:val="99"/>
-    <w:pPr>
-      <w:widowControl/>
-      <w:spacing w:lineRule="auto" w:after="0" w:line="276" w:before="0"/>
-      <w:ind w:firstLine="0" w:left="720"/>
-    </w:pPr>
-    <w:rPr>
-      <w:rFonts w:eastAsia="Calibri" w:hAnsi="Calibri" w:cs="Calibri" w:ascii="Calibri"/>
-      <w:sz w:val="24"/>
-      <w:szCs w:val="24"/>
-      <w:color w:val="000000"/>
-    </w:rPr>
-  </w:style>
-  <w:style w:styleId="Reference" w:type="paragraph" w:customStyle="1">
-    <w:name w:val="Reference"/>
-    <w:basedOn w:val="Normal"/>
-    <w:qFormat/>
-    <w:uiPriority w:val="99"/>
-    <w:pPr>
-      <w:widowControl/>
-      <w:spacing w:lineRule="auto" w:after="120" w:line="276" w:before="0"/>
-      <w:ind w:left="720" w:hanging="720"/>
-    </w:pPr>
-    <w:rPr>
-      <w:rFonts w:eastAsia="Calibri" w:hAnsi="Calibri" w:cs="Calibri" w:ascii="Calibri"/>
-      <w:sz w:val="24"/>
-      <w:szCs w:val="24"/>
-    </w:rPr>
-  </w:style>
-  <w:style w:styleId="CoverDocId" w:type="paragraph" w:customStyle="1">
-    <w:name w:val="Cover Document ID"/>
-    <w:basedOn w:val="Normal"/>
-    <w:qFormat/>
-    <w:uiPriority w:val="99"/>
-    <w:pPr>
-      <w:widowControl/>
-      <w:spacing w:lineRule="auto" w:after="80" w:line="240" w:before="0"/>
-      <w:ind w:firstLine="0"/>
-      <w:jc w:val="center"/>
-    </w:pPr>
-    <w:rPr>
-      <w:rFonts w:eastAsia="Calibri" w:hAnsi="Calibri" w:cs="Calibri" w:ascii="Calibri"/>
-      <w:sz w:val="20"/>
-      <w:szCs w:val="20"/>
-      <w:color w:val="888888"/>
-    </w:rPr>
-  </w:style>
-  <w:style w:styleId="Quote" w:type="paragraph">
-    <w:name w:val="Quote"/>
-    <w:basedOn w:val="Normal"/>
-    <w:qFormat/>
-    <w:uiPriority w:val="99"/>
-    <w:pPr>
-      <w:widowControl/>
-      <w:spacing w:lineRule="auto" w:after="160" w:line="276" w:before="200"/>
-      <w:ind w:right="720" w:firstLine="0" w:left="720"/>
-    </w:pPr>
-    <w:rPr>
-      <w:rFonts w:eastAsia="Calibri" w:hAnsi="Calibri" w:cs="Calibri" w:ascii="Calibri"/>
-      <w:i/>
-      <w:iCs/>
-      <w:sz w:val="24"/>
-      <w:szCs w:val="24"/>
-      <w:color w:val="404040"/>
-    </w:rPr>
-  </w:style>
-  <w:style w:styleId="CoverDate" w:type="paragraph" w:customStyle="1">
-    <w:name w:val="Cover Date"/>
-    <w:basedOn w:val="Normal"/>
-    <w:qFormat/>
-    <w:uiPriority w:val="99"/>
-    <w:pPr>
-      <w:widowControl/>
-      <w:spacing w:lineRule="auto" w:after="80" w:line="240" w:before="0"/>
-      <w:ind w:firstLine="0"/>
-      <w:jc w:val="center"/>
-    </w:pPr>
-    <w:rPr>
-      <w:rFonts w:eastAsia="Calibri" w:hAnsi="Calibri" w:cs="Calibri" w:ascii="Calibri"/>
-      <w:i/>
-      <w:iCs/>
-      <w:sz w:val="24"/>
-      <w:szCs w:val="24"/>
-      <w:color w:val="666666"/>
-    </w:rPr>
-  </w:style>
-  <w:style w:styleId="Source" w:type="paragraph" w:customStyle="1">
-    <w:name w:val="Source"/>
-    <w:basedOn w:val="Normal"/>
-    <w:qFormat/>
-    <w:uiPriority w:val="99"/>
-    <w:pPr>
-      <w:widowControl/>
-      <w:spacing w:lineRule="auto" w:after="80" w:line="240" w:before="0"/>
-      <w:ind w:firstLine="0"/>
-    </w:pPr>
-    <w:rPr>
-      <w:rFonts w:eastAsia="Calibri" w:hAnsi="Calibri" w:cs="Calibri" w:ascii="Calibri"/>
-      <w:sz w:val="18"/>
-      <w:szCs w:val="18"/>
-    </w:rPr>
-  </w:style>
-  <w:style w:styleId="CoverTitle" w:type="paragraph" w:customStyle="1">
-    <w:name w:val="Cover Title"/>
-    <w:basedOn w:val="Normal"/>
-    <w:qFormat/>
-    <w:uiPriority w:val="99"/>
-    <w:pPr>
-      <w:widowControl/>
-      <w:spacing w:lineRule="auto" w:after="240" w:line="240" w:before="0"/>
-      <w:ind w:firstLine="0"/>
-      <w:jc w:val="center"/>
-    </w:pPr>
-    <w:rPr>
-      <w:rFonts w:eastAsia="Calibri" w:hAnsi="Calibri" w:cs="Calibri" w:ascii="Calibri"/>
-      <w:b/>
-      <w:bCs/>
-      <w:sz w:val="56"/>
-      <w:szCs w:val="56"/>
-      <w:color w:val="000000"/>
-    </w:rPr>
-  </w:style>
-  <w:style w:styleId="TOC2" w:type="paragraph">
-    <w:name w:val="TOC 2"/>
-    <w:basedOn w:val="Normal"/>
-    <w:qFormat/>
-    <w:uiPriority w:val="99"/>
-    <w:pPr>
-      <w:widowControl/>
-      <w:spacing w:lineRule="auto" w:after="0" w:line="276" w:before="0"/>
-      <w:ind w:firstLine="0" w:left="360"/>
-    </w:pPr>
-    <w:rPr>
-      <w:rFonts w:eastAsia="Calibri" w:hAnsi="Calibri" w:cs="Calibri" w:ascii="Calibri"/>
-      <w:sz w:val="24"/>
-      <w:szCs w:val="24"/>
-      <w:color w:val="000000"/>
-    </w:rPr>
-  </w:style>
-  <w:style w:styleId="Header" w:type="paragraph" w:customStyle="1">
+  <w:style w:styleId="Header" w:customStyle="1" w:type="paragraph">
     <w:name w:val="Header"/>
     <w:basedOn w:val="Normal"/>
     <w:qFormat/>
@@ -12422,42 +12541,12 @@
       <w:ind w:firstLine="0"/>
     </w:pPr>
     <w:rPr>
-      <w:rFonts w:eastAsia="Calibri" w:hAnsi="Calibri" w:cs="Calibri" w:ascii="Calibri"/>
+      <w:rFonts w:ascii="Calibri" w:hAnsi="Calibri" w:eastAsia="Calibri" w:cs="Calibri"/>
       <w:sz w:val="20"/>
       <w:szCs w:val="20"/>
     </w:rPr>
   </w:style>
-  <w:style w:styleId="FigureCenter" w:type="paragraph" w:customStyle="1">
-    <w:name w:val="Figure Center"/>
-    <w:basedOn w:val="Normal"/>
-    <w:qFormat/>
-    <w:uiPriority w:val="99"/>
-    <w:pPr>
-      <w:widowControl/>
-      <w:spacing w:lineRule="auto" w:after="120" w:line="240" w:before="120"/>
-      <w:ind w:firstLine="0"/>
-      <w:jc w:val="center"/>
-    </w:pPr>
-  </w:style>
-  <w:style w:styleId="CoverAuthor" w:type="paragraph" w:customStyle="1">
-    <w:name w:val="Cover Author"/>
-    <w:basedOn w:val="Normal"/>
-    <w:qFormat/>
-    <w:uiPriority w:val="99"/>
-    <w:pPr>
-      <w:widowControl/>
-      <w:spacing w:lineRule="auto" w:after="80" w:line="240" w:before="0"/>
-      <w:ind w:firstLine="0"/>
-      <w:jc w:val="center"/>
-    </w:pPr>
-    <w:rPr>
-      <w:rFonts w:eastAsia="Calibri" w:hAnsi="Calibri" w:cs="Calibri" w:ascii="Calibri"/>
-      <w:sz w:val="24"/>
-      <w:szCs w:val="24"/>
-      <w:color w:val="000000"/>
-    </w:rPr>
-  </w:style>
-  <w:style w:styleId="Footer" w:type="paragraph" w:customStyle="1">
+  <w:style w:styleId="Footer" w:customStyle="1" w:type="paragraph">
     <w:name w:val="Footer"/>
     <w:basedOn w:val="Normal"/>
     <w:qFormat/>
@@ -12468,27 +12557,26 @@
       <w:ind w:firstLine="0"/>
     </w:pPr>
     <w:rPr>
-      <w:rFonts w:eastAsia="Calibri" w:hAnsi="Calibri" w:cs="Calibri" w:ascii="Calibri"/>
+      <w:rFonts w:ascii="Calibri" w:hAnsi="Calibri" w:eastAsia="Calibri" w:cs="Calibri"/>
       <w:sz w:val="20"/>
       <w:szCs w:val="20"/>
     </w:rPr>
   </w:style>
-  <w:style w:styleId="CoverVersion" w:type="paragraph" w:customStyle="1">
-    <w:name w:val="Cover Version"/>
+  <w:style w:styleId="TOC3" w:type="paragraph">
+    <w:name w:val="TOC 3"/>
     <w:basedOn w:val="Normal"/>
     <w:qFormat/>
     <w:uiPriority w:val="99"/>
     <w:pPr>
       <w:widowControl/>
-      <w:spacing w:lineRule="auto" w:after="80" w:line="240" w:before="0"/>
-      <w:ind w:firstLine="0"/>
-      <w:jc w:val="center"/>
+      <w:spacing w:after="0" w:before="0" w:lineRule="auto" w:line="276"/>
+      <w:ind w:firstLine="0" w:left="720"/>
     </w:pPr>
     <w:rPr>
-      <w:rFonts w:eastAsia="Calibri" w:hAnsi="Calibri" w:cs="Calibri" w:ascii="Calibri"/>
-      <w:sz w:val="20"/>
-      <w:szCs w:val="20"/>
-      <w:color w:val="888888"/>
+      <w:rFonts w:ascii="Calibri" w:hAnsi="Calibri" w:eastAsia="Calibri" w:cs="Calibri"/>
+      <w:sz w:val="24"/>
+      <w:szCs w:val="24"/>
+      <w:color w:val="000000"/>
     </w:rPr>
   </w:style>
 </w:styles>

</xml_diff>